<commit_message>
Docs: build prompt and workflows v4.0, matching the app as built and tested
Co-Authored-By: Claude Opus 5.5 <noreply@anthropic.com>
Claude-Session: https://claude.ai/code/session_01Xo7yHABwmtJhxZW1a5iyND
</commit_message>
<xml_diff>
--- a/docs/ARAL_Inspection_App_Build_Prompt_and_Workflows.docx
+++ b/docs/ARAL_Inspection_App_Build_Prompt_and_Workflows.docx
@@ -101,7 +101,7 @@
           <w:sz w:val="22"/>
           <w:szCs w:val="22"/>
         </w:rPr>
-        <w:t xml:space="preserve">Version 3.2  ·  21 October 2026</w:t>
+        <w:t xml:space="preserve">Version 4.0  ·  22 October 2026</w:t>
       </w:r>
     </w:p>
     <w:p>
@@ -128,7 +128,7 @@
           <w:sz w:val="22"/>
           <w:szCs w:val="22"/>
         </w:rPr>
-        <w:t xml:space="preserve">Phase 1 approved  ·  Phase 2 delivered  ·  Phase 3 next</w:t>
+        <w:t xml:space="preserve">App built end to end  ·  in testing  ·  live settings pending</w:t>
       </w:r>
     </w:p>
     <w:p>
@@ -425,6 +425,33 @@
         <w:tabs>
           <w:tab w:val="right" w:pos="9906" w:leader="dot"/>
         </w:tabs>
+        <w:spacing w:after="40" w:before="40"/>
+        <w:ind w:left="0"/>
+      </w:pPr>
+      <w:r>
+        <w:rPr>
+          <w:b w:val="false"/>
+          <w:bCs w:val="false"/>
+          <w:color w:val="16213A"/>
+          <w:sz w:val="21"/>
+          <w:szCs w:val="21"/>
+        </w:rPr>
+        <w:t xml:space="preserve">Before you go live</w:t>
+      </w:r>
+      <w:r>
+        <w:rPr>
+          <w:color w:val="5B6782"/>
+          <w:sz w:val="20"/>
+          <w:szCs w:val="20"/>
+        </w:rPr>
+        <w:t xml:space="preserve">	14</w:t>
+      </w:r>
+    </w:p>
+    <w:p>
+      <w:pPr>
+        <w:tabs>
+          <w:tab w:val="right" w:pos="9906" w:leader="dot"/>
+        </w:tabs>
         <w:spacing w:after="40" w:before="200"/>
         <w:ind w:left="0"/>
       </w:pPr>
@@ -444,7 +471,7 @@
           <w:sz w:val="20"/>
           <w:szCs w:val="20"/>
         </w:rPr>
-        <w:t xml:space="preserve">	14</w:t>
+        <w:t xml:space="preserve">	15</w:t>
       </w:r>
     </w:p>
     <w:p>
@@ -471,7 +498,7 @@
           <w:sz w:val="20"/>
           <w:szCs w:val="20"/>
         </w:rPr>
-        <w:t xml:space="preserve">	15</w:t>
+        <w:t xml:space="preserve">	16</w:t>
       </w:r>
     </w:p>
     <w:p>
@@ -498,7 +525,7 @@
           <w:sz w:val="20"/>
           <w:szCs w:val="20"/>
         </w:rPr>
-        <w:t xml:space="preserve">	15</w:t>
+        <w:t xml:space="preserve">	16</w:t>
       </w:r>
     </w:p>
     <w:p>
@@ -525,7 +552,7 @@
           <w:sz w:val="20"/>
           <w:szCs w:val="20"/>
         </w:rPr>
-        <w:t xml:space="preserve">	16</w:t>
+        <w:t xml:space="preserve">	17</w:t>
       </w:r>
     </w:p>
     <w:p>
@@ -552,7 +579,7 @@
           <w:sz w:val="20"/>
           <w:szCs w:val="20"/>
         </w:rPr>
-        <w:t xml:space="preserve">	16</w:t>
+        <w:t xml:space="preserve">	17</w:t>
       </w:r>
     </w:p>
     <w:p>
@@ -579,7 +606,7 @@
           <w:sz w:val="20"/>
           <w:szCs w:val="20"/>
         </w:rPr>
-        <w:t xml:space="preserve">	16</w:t>
+        <w:t xml:space="preserve">	17</w:t>
       </w:r>
     </w:p>
     <w:p>
@@ -606,7 +633,7 @@
           <w:sz w:val="20"/>
           <w:szCs w:val="20"/>
         </w:rPr>
-        <w:t xml:space="preserve">	17</w:t>
+        <w:t xml:space="preserve">	18</w:t>
       </w:r>
     </w:p>
     <w:p>
@@ -633,7 +660,7 @@
           <w:sz w:val="20"/>
           <w:szCs w:val="20"/>
         </w:rPr>
-        <w:t xml:space="preserve">	17</w:t>
+        <w:t xml:space="preserve">	18</w:t>
       </w:r>
     </w:p>
     <w:p>
@@ -660,7 +687,7 @@
           <w:sz w:val="20"/>
           <w:szCs w:val="20"/>
         </w:rPr>
-        <w:t xml:space="preserve">	18</w:t>
+        <w:t xml:space="preserve">	19</w:t>
       </w:r>
     </w:p>
     <w:p>
@@ -687,7 +714,7 @@
           <w:sz w:val="20"/>
           <w:szCs w:val="20"/>
         </w:rPr>
-        <w:t xml:space="preserve">	18</w:t>
+        <w:t xml:space="preserve">	19</w:t>
       </w:r>
     </w:p>
     <w:p>
@@ -714,7 +741,7 @@
           <w:sz w:val="20"/>
           <w:szCs w:val="20"/>
         </w:rPr>
-        <w:t xml:space="preserve">	19</w:t>
+        <w:t xml:space="preserve">	20</w:t>
       </w:r>
     </w:p>
     <w:p>
@@ -741,7 +768,7 @@
           <w:sz w:val="20"/>
           <w:szCs w:val="20"/>
         </w:rPr>
-        <w:t xml:space="preserve">	19</w:t>
+        <w:t xml:space="preserve">	20</w:t>
       </w:r>
     </w:p>
     <w:p>
@@ -768,7 +795,7 @@
           <w:sz w:val="20"/>
           <w:szCs w:val="20"/>
         </w:rPr>
-        <w:t xml:space="preserve">	20</w:t>
+        <w:t xml:space="preserve">	21</w:t>
       </w:r>
     </w:p>
     <w:p>
@@ -795,7 +822,7 @@
           <w:sz w:val="20"/>
           <w:szCs w:val="20"/>
         </w:rPr>
-        <w:t xml:space="preserve">	21</w:t>
+        <w:t xml:space="preserve">	23</w:t>
       </w:r>
     </w:p>
     <w:p>
@@ -822,7 +849,7 @@
           <w:sz w:val="20"/>
           <w:szCs w:val="20"/>
         </w:rPr>
-        <w:t xml:space="preserve">	21</w:t>
+        <w:t xml:space="preserve">	23</w:t>
       </w:r>
     </w:p>
     <w:p>
@@ -849,7 +876,7 @@
           <w:sz w:val="20"/>
           <w:szCs w:val="20"/>
         </w:rPr>
-        <w:t xml:space="preserve">	22</w:t>
+        <w:t xml:space="preserve">	23</w:t>
       </w:r>
     </w:p>
     <w:p>
@@ -876,7 +903,7 @@
           <w:sz w:val="20"/>
           <w:szCs w:val="20"/>
         </w:rPr>
-        <w:t xml:space="preserve">	22</w:t>
+        <w:t xml:space="preserve">	24</w:t>
       </w:r>
     </w:p>
     <w:p>
@@ -903,7 +930,7 @@
           <w:sz w:val="20"/>
           <w:szCs w:val="20"/>
         </w:rPr>
-        <w:t xml:space="preserve">	22</w:t>
+        <w:t xml:space="preserve">	24</w:t>
       </w:r>
     </w:p>
     <w:p>
@@ -930,7 +957,7 @@
           <w:sz w:val="20"/>
           <w:szCs w:val="20"/>
         </w:rPr>
-        <w:t xml:space="preserve">	23</w:t>
+        <w:t xml:space="preserve">	24</w:t>
       </w:r>
     </w:p>
     <w:p>
@@ -957,7 +984,7 @@
           <w:sz w:val="20"/>
           <w:szCs w:val="20"/>
         </w:rPr>
-        <w:t xml:space="preserve">	23</w:t>
+        <w:t xml:space="preserve">	24</w:t>
       </w:r>
     </w:p>
     <w:p>
@@ -984,7 +1011,7 @@
           <w:sz w:val="20"/>
           <w:szCs w:val="20"/>
         </w:rPr>
-        <w:t xml:space="preserve">	23</w:t>
+        <w:t xml:space="preserve">	25</w:t>
       </w:r>
     </w:p>
     <w:p>
@@ -1011,7 +1038,7 @@
           <w:sz w:val="20"/>
           <w:szCs w:val="20"/>
         </w:rPr>
-        <w:t xml:space="preserve">	24</w:t>
+        <w:t xml:space="preserve">	25</w:t>
       </w:r>
     </w:p>
     <w:p>
@@ -1038,7 +1065,7 @@
           <w:sz w:val="20"/>
           <w:szCs w:val="20"/>
         </w:rPr>
-        <w:t xml:space="preserve">	24</w:t>
+        <w:t xml:space="preserve">	25</w:t>
       </w:r>
     </w:p>
     <w:p>
@@ -1150,14 +1177,30 @@
                 <w:sz w:val="20"/>
                 <w:szCs w:val="20"/>
               </w:rPr>
-              <w:t xml:space="preserve">Phase 1 (design) approved on 21 October 2026.</w:t>
+              <w:t xml:space="preserve">The app is built end to end</w:t>
             </w:r>
             <w:r>
               <w:rPr>
                 <w:sz w:val="20"/>
                 <w:szCs w:val="20"/>
               </w:rPr>
-              <w:t xml:space="preserve"> Database, report field mapping and screen layouts.</w:t>
+              <w:t xml:space="preserve"> and running on Render for testing: leads, quotations, e-signed agreement, card payments (demo), scheduling and calendar, the phone inspection app, technical review, PDF reports with attachments, invoices, commissions, dashboard and Excel exports, in English and Arabic. Code in GitHub: </w:t>
+            </w:r>
+            <w:r>
+              <w:rPr>
+                <w:rFonts w:ascii="Consolas" w:cs="Consolas" w:eastAsia="Consolas" w:hAnsi="Consolas"/>
+                <w:color w:val="0B4F8C"/>
+                <w:sz w:val="18"/>
+                <w:szCs w:val="18"/>
+              </w:rPr>
+              <w:t xml:space="preserve">ananader1977/aral-inspection</w:t>
+            </w:r>
+            <w:r>
+              <w:rPr>
+                <w:sz w:val="20"/>
+                <w:szCs w:val="20"/>
+              </w:rPr>
+              <w:t xml:space="preserve">.</w:t>
             </w:r>
           </w:p>
           <w:p>
@@ -1171,30 +1214,14 @@
                 <w:sz w:val="20"/>
                 <w:szCs w:val="20"/>
               </w:rPr>
-              <w:t xml:space="preserve">Phase 2 (foundation) delivered.</w:t>
+              <w:t xml:space="preserve">This version (4.0) reflects how the app works today,</w:t>
             </w:r>
             <w:r>
               <w:rPr>
                 <w:sz w:val="20"/>
                 <w:szCs w:val="20"/>
               </w:rPr>
-              <w:t xml:space="preserve"> Sign-in with two-step codes, roles, users, company settings, terms and wording with versions, service catalogue and prices, inspectors, equipment, checklists, comment library, English and Arabic screens. Code in GitHub: </w:t>
-            </w:r>
-            <w:r>
-              <w:rPr>
-                <w:rFonts w:ascii="Consolas" w:cs="Consolas" w:eastAsia="Consolas" w:hAnsi="Consolas"/>
-                <w:color w:val="0B4F8C"/>
-                <w:sz w:val="18"/>
-                <w:szCs w:val="18"/>
-              </w:rPr>
-              <w:t xml:space="preserve">ananader1977/aral-inspection</w:t>
-            </w:r>
-            <w:r>
-              <w:rPr>
-                <w:sz w:val="20"/>
-                <w:szCs w:val="20"/>
-              </w:rPr>
-              <w:t xml:space="preserve">.</w:t>
+              <w:t xml:space="preserve"> including the changes made during testing: signing link emails, payments taken by the office, the inspection created at payment, the full-week calendar, system checklists for AC, electrical and water heater, and report attachments.</w:t>
             </w:r>
           </w:p>
           <w:p>
@@ -1208,14 +1235,14 @@
                 <w:sz w:val="20"/>
                 <w:szCs w:val="20"/>
               </w:rPr>
-              <w:t xml:space="preserve">Phase 3 is next:</w:t>
+              <w:t xml:space="preserve">Still to do before going live:</w:t>
             </w:r>
             <w:r>
               <w:rPr>
                 <w:sz w:val="20"/>
                 <w:szCs w:val="20"/>
               </w:rPr>
-              <w:t xml:space="preserve"> leads, client requests, the pricing engine, quotations and the PDF engine.</w:t>
+              <w:t xml:space="preserve"> the settings in "Before you go live" (Part A), the lawyer-approved wording, and the Stripe and Google Drive keys.</w:t>
             </w:r>
           </w:p>
         </w:tc>
@@ -5121,7 +5148,7 @@
       <w:r>
         <w:drawing>
           <wp:inline distT="0" distB="0" distL="0" distR="0">
-            <wp:extent cx="5715000" cy="2238375"/>
+            <wp:extent cx="5715000" cy="2257425"/>
             <wp:effectExtent t="0" r="0" b="0" l="0"/>
             <wp:docPr id="2" name="overview.png" descr="overview.png" title="overview.png"/>
             <wp:cNvGraphicFramePr>
@@ -5146,7 +5173,7 @@
                   <pic:spPr bwMode="auto">
                     <a:xfrm>
                       <a:off x="0" y="0"/>
-                      <a:ext cx="5715000" cy="2238375"/>
+                      <a:ext cx="5715000" cy="2257425"/>
                     </a:xfrm>
                     <a:prstGeom prst="rect">
                       <a:avLst/>
@@ -5652,7 +5679,7 @@
                 <w:sz w:val="18"/>
                 <w:szCs w:val="18"/>
               </w:rPr>
-              <w:t xml:space="preserve">Client</w:t>
+              <w:t xml:space="preserve">Client (or the office for the client)</w:t>
             </w:r>
           </w:p>
         </w:tc>
@@ -5683,7 +5710,7 @@
                 <w:sz w:val="18"/>
                 <w:szCs w:val="18"/>
               </w:rPr>
-              <w:t xml:space="preserve">Service agreement to sign, card checkout, receipt</w:t>
+              <w:t xml:space="preserve">Signing link, signed agreement PDF, card checkout, receipt</w:t>
             </w:r>
           </w:p>
         </w:tc>
@@ -5817,7 +5844,7 @@
                 <w:sz w:val="18"/>
                 <w:szCs w:val="18"/>
               </w:rPr>
-              <w:t xml:space="preserve">Confirmation with date, time and inspector; reminder the day before</w:t>
+              <w:t xml:space="preserve">Confirmation email with date, time, inspector and a calendar invite</w:t>
             </w:r>
           </w:p>
         </w:tc>
@@ -6184,7 +6211,7 @@
                 <w:sz w:val="18"/>
                 <w:szCs w:val="18"/>
               </w:rPr>
-              <w:t xml:space="preserve">System</w:t>
+              <w:t xml:space="preserve">Technical Manager</w:t>
             </w:r>
           </w:p>
         </w:tc>
@@ -6215,7 +6242,7 @@
                 <w:sz w:val="18"/>
                 <w:szCs w:val="18"/>
               </w:rPr>
-              <w:t xml:space="preserve">Report PDF with photos, QR code and online videos</w:t>
+              <w:t xml:space="preserve">Report PDF with photos, attachments, QR code and the online report link</w:t>
             </w:r>
           </w:p>
         </w:tc>
@@ -6481,7 +6508,7 @@
                 <w:sz w:val="18"/>
                 <w:szCs w:val="18"/>
               </w:rPr>
-              <w:t xml:space="preserve">A short feedback request</w:t>
+              <w:t xml:space="preserve">A star rating on the online report</w:t>
             </w:r>
           </w:p>
         </w:tc>
@@ -8259,7 +8286,7 @@
       <w:r>
         <w:drawing>
           <wp:inline distT="0" distB="0" distL="0" distR="0">
-            <wp:extent cx="5715000" cy="2381250"/>
+            <wp:extent cx="5715000" cy="2438400"/>
             <wp:effectExtent t="0" r="0" b="0" l="0"/>
             <wp:docPr id="4" name="quotation.png" descr="quotation.png" title="quotation.png"/>
             <wp:cNvGraphicFramePr>
@@ -8284,7 +8311,7 @@
                   <pic:spPr bwMode="auto">
                     <a:xfrm>
                       <a:off x="0" y="0"/>
-                      <a:ext cx="5715000" cy="2381250"/>
+                      <a:ext cx="5715000" cy="2438400"/>
                     </a:xfrm>
                     <a:prstGeom prst="rect">
                       <a:avLst/>
@@ -8597,7 +8624,7 @@
                 <w:sz w:val="18"/>
                 <w:szCs w:val="18"/>
               </w:rPr>
-              <w:t xml:space="preserve">System</w:t>
+              <w:t xml:space="preserve">Admin</w:t>
             </w:r>
           </w:p>
         </w:tc>
@@ -8628,7 +8655,7 @@
                 <w:sz w:val="18"/>
                 <w:szCs w:val="18"/>
               </w:rPr>
-              <w:t xml:space="preserve">Fills the price from the service, property type and bedrooms, or the bank's rate card. Adds thermal imaging if chosen. Developer services are quoted per project.</w:t>
+              <w:t xml:space="preserve">Fills the lines from the service, property type and bedrooms, or the client's negotiated rate. Developer services are priced per proposal. Discounts over 10% need the Super Admin.</w:t>
             </w:r>
           </w:p>
         </w:tc>
@@ -8659,7 +8686,7 @@
                 <w:sz w:val="18"/>
                 <w:szCs w:val="18"/>
               </w:rPr>
-              <w:t xml:space="preserve">Quote draft</w:t>
+              <w:t xml:space="preserve">New request</w:t>
             </w:r>
           </w:p>
         </w:tc>
@@ -8728,7 +8755,7 @@
                 <w:sz w:val="18"/>
                 <w:szCs w:val="18"/>
               </w:rPr>
-              <w:t xml:space="preserve">Check and adjust</w:t>
+              <w:t xml:space="preserve">Send to the client</w:t>
             </w:r>
           </w:p>
         </w:tc>
@@ -8792,7 +8819,7 @@
                 <w:sz w:val="18"/>
                 <w:szCs w:val="18"/>
               </w:rPr>
-              <w:t xml:space="preserve">Blocks discounts above the Admin's limit. Prints only the scope blocks that apply (e.g. no pool section for apartments).</w:t>
+              <w:t xml:space="preserve">Numbers the quote (QT-2026-00001, revisions -R1, -R2), emails the PDF from Gmail and shows the client link on the job page (copy, open, WhatsApp).</w:t>
             </w:r>
           </w:p>
         </w:tc>
@@ -8824,7 +8851,7 @@
                 <w:sz w:val="18"/>
                 <w:szCs w:val="18"/>
               </w:rPr>
-              <w:t xml:space="preserve">Quote draft</w:t>
+              <w:t xml:space="preserve">Quoted</w:t>
             </w:r>
           </w:p>
         </w:tc>
@@ -8891,7 +8918,7 @@
                 <w:sz w:val="18"/>
                 <w:szCs w:val="18"/>
               </w:rPr>
-              <w:t xml:space="preserve">Send to the client</w:t>
+              <w:t xml:space="preserve">Client decides</w:t>
             </w:r>
           </w:p>
         </w:tc>
@@ -8922,7 +8949,7 @@
                 <w:sz w:val="18"/>
                 <w:szCs w:val="18"/>
               </w:rPr>
-              <w:t xml:space="preserve">Admin</w:t>
+              <w:t xml:space="preserve">Client</w:t>
             </w:r>
           </w:p>
         </w:tc>
@@ -8953,7 +8980,7 @@
                 <w:sz w:val="18"/>
                 <w:szCs w:val="18"/>
               </w:rPr>
-              <w:t xml:space="preserve">Numbers the quote (QT-2026-00001), emails the PDF from Gmail, and logs it under Messages.</w:t>
+              <w:t xml:space="preserve">Records the name, time and IP of the acceptance and emails the client the signing link straight away.</w:t>
             </w:r>
           </w:p>
         </w:tc>
@@ -8984,7 +9011,7 @@
                 <w:sz w:val="18"/>
                 <w:szCs w:val="18"/>
               </w:rPr>
-              <w:t xml:space="preserve">Quoted</w:t>
+              <w:t xml:space="preserve">Quote accepted</w:t>
             </w:r>
           </w:p>
         </w:tc>
@@ -9053,7 +9080,7 @@
                 <w:sz w:val="18"/>
                 <w:szCs w:val="18"/>
               </w:rPr>
-              <w:t xml:space="preserve">Client decides</w:t>
+              <w:t xml:space="preserve">Sign the agreement</w:t>
             </w:r>
           </w:p>
         </w:tc>
@@ -9117,7 +9144,7 @@
                 <w:sz w:val="18"/>
                 <w:szCs w:val="18"/>
               </w:rPr>
-              <w:t xml:space="preserve">Records the decision with name, time and IP address. Reminds automatically before expiry.</w:t>
+              <w:t xml:space="preserve">Stores the signature, time and IP, makes the signed agreement PDF and emails it to the client.</w:t>
             </w:r>
           </w:p>
         </w:tc>
@@ -9149,7 +9176,7 @@
                 <w:sz w:val="18"/>
                 <w:szCs w:val="18"/>
               </w:rPr>
-              <w:t xml:space="preserve">Quote accepted / rejected / expired</w:t>
+              <w:t xml:space="preserve">Agreement signed</w:t>
             </w:r>
           </w:p>
         </w:tc>
@@ -9216,7 +9243,7 @@
                 <w:sz w:val="18"/>
                 <w:szCs w:val="18"/>
               </w:rPr>
-              <w:t xml:space="preserve">Sign the agreement</w:t>
+              <w:t xml:space="preserve">Take the payment</w:t>
             </w:r>
           </w:p>
         </w:tc>
@@ -9278,7 +9305,7 @@
                 <w:sz w:val="18"/>
                 <w:szCs w:val="18"/>
               </w:rPr>
-              <w:t xml:space="preserve">Emails the service agreement with the current terms version. Stores the signature, time and IP.</w:t>
+              <w:t xml:space="preserve">Records the payment, emails the receipt PDF, and creates the inspection with its rooms and items.</w:t>
             </w:r>
           </w:p>
         </w:tc>
@@ -9291,171 +9318,6 @@
               <w:bottom w:val="single" w:color="C9D2DE" w:sz="4"/>
               <w:right w:val="single" w:color="C9D2DE" w:sz="4"/>
             </w:tcBorders>
-            <w:tcMar>
-              <w:top w:type="dxa" w:w="50"/>
-              <w:left w:type="dxa" w:w="90"/>
-              <w:bottom w:type="dxa" w:w="50"/>
-              <w:right w:type="dxa" w:w="90"/>
-            </w:tcMar>
-            <w:vAlign w:val="top"/>
-          </w:tcPr>
-          <w:p>
-            <w:pPr>
-              <w:keepNext w:val="false"/>
-              <w:spacing w:after="20" w:line="260"/>
-            </w:pPr>
-            <w:r>
-              <w:rPr>
-                <w:sz w:val="18"/>
-                <w:szCs w:val="18"/>
-              </w:rPr>
-              <w:t xml:space="preserve">Agreement signed</w:t>
-            </w:r>
-          </w:p>
-        </w:tc>
-      </w:tr>
-      <w:tr>
-        <w:trPr>
-          <w:cantSplit/>
-        </w:trPr>
-        <w:tc>
-          <w:tcPr>
-            <w:tcW w:type="dxa" w:w="404"/>
-            <w:tcBorders>
-              <w:top w:val="single" w:color="C9D2DE" w:sz="4"/>
-              <w:left w:val="single" w:color="C9D2DE" w:sz="4"/>
-              <w:bottom w:val="single" w:color="C9D2DE" w:sz="4"/>
-              <w:right w:val="single" w:color="C9D2DE" w:sz="4"/>
-            </w:tcBorders>
-            <w:shd w:fill="F7F9FC" w:color="auto" w:val="clear"/>
-            <w:tcMar>
-              <w:top w:type="dxa" w:w="50"/>
-              <w:left w:type="dxa" w:w="90"/>
-              <w:bottom w:type="dxa" w:w="50"/>
-              <w:right w:type="dxa" w:w="90"/>
-            </w:tcMar>
-            <w:vAlign w:val="top"/>
-          </w:tcPr>
-          <w:p>
-            <w:pPr>
-              <w:keepNext w:val="false"/>
-              <w:spacing w:after="20" w:line="260"/>
-            </w:pPr>
-            <w:r>
-              <w:rPr>
-                <w:sz w:val="18"/>
-                <w:szCs w:val="18"/>
-              </w:rPr>
-              <w:t xml:space="preserve">6</w:t>
-            </w:r>
-          </w:p>
-        </w:tc>
-        <w:tc>
-          <w:tcPr>
-            <w:tcW w:type="dxa" w:w="1617"/>
-            <w:tcBorders>
-              <w:top w:val="single" w:color="C9D2DE" w:sz="4"/>
-              <w:left w:val="single" w:color="C9D2DE" w:sz="4"/>
-              <w:bottom w:val="single" w:color="C9D2DE" w:sz="4"/>
-              <w:right w:val="single" w:color="C9D2DE" w:sz="4"/>
-            </w:tcBorders>
-            <w:shd w:fill="F7F9FC" w:color="auto" w:val="clear"/>
-            <w:tcMar>
-              <w:top w:type="dxa" w:w="50"/>
-              <w:left w:type="dxa" w:w="90"/>
-              <w:bottom w:type="dxa" w:w="50"/>
-              <w:right w:type="dxa" w:w="90"/>
-            </w:tcMar>
-            <w:vAlign w:val="top"/>
-          </w:tcPr>
-          <w:p>
-            <w:pPr>
-              <w:keepNext w:val="false"/>
-              <w:spacing w:after="20" w:line="260"/>
-            </w:pPr>
-            <w:r>
-              <w:rPr>
-                <w:sz w:val="18"/>
-                <w:szCs w:val="18"/>
-              </w:rPr>
-              <w:t xml:space="preserve">Pay</w:t>
-            </w:r>
-          </w:p>
-        </w:tc>
-        <w:tc>
-          <w:tcPr>
-            <w:tcW w:type="dxa" w:w="1213"/>
-            <w:tcBorders>
-              <w:top w:val="single" w:color="C9D2DE" w:sz="4"/>
-              <w:left w:val="single" w:color="C9D2DE" w:sz="4"/>
-              <w:bottom w:val="single" w:color="C9D2DE" w:sz="4"/>
-              <w:right w:val="single" w:color="C9D2DE" w:sz="4"/>
-            </w:tcBorders>
-            <w:shd w:fill="F7F9FC" w:color="auto" w:val="clear"/>
-            <w:tcMar>
-              <w:top w:type="dxa" w:w="50"/>
-              <w:left w:type="dxa" w:w="90"/>
-              <w:bottom w:type="dxa" w:w="50"/>
-              <w:right w:type="dxa" w:w="90"/>
-            </w:tcMar>
-            <w:vAlign w:val="top"/>
-          </w:tcPr>
-          <w:p>
-            <w:pPr>
-              <w:keepNext w:val="false"/>
-              <w:spacing w:after="20" w:line="260"/>
-            </w:pPr>
-            <w:r>
-              <w:rPr>
-                <w:sz w:val="18"/>
-                <w:szCs w:val="18"/>
-              </w:rPr>
-              <w:t xml:space="preserve">Client</w:t>
-            </w:r>
-          </w:p>
-        </w:tc>
-        <w:tc>
-          <w:tcPr>
-            <w:tcW w:type="dxa" w:w="4852"/>
-            <w:tcBorders>
-              <w:top w:val="single" w:color="C9D2DE" w:sz="4"/>
-              <w:left w:val="single" w:color="C9D2DE" w:sz="4"/>
-              <w:bottom w:val="single" w:color="C9D2DE" w:sz="4"/>
-              <w:right w:val="single" w:color="C9D2DE" w:sz="4"/>
-            </w:tcBorders>
-            <w:shd w:fill="F7F9FC" w:color="auto" w:val="clear"/>
-            <w:tcMar>
-              <w:top w:type="dxa" w:w="50"/>
-              <w:left w:type="dxa" w:w="90"/>
-              <w:bottom w:type="dxa" w:w="50"/>
-              <w:right w:type="dxa" w:w="90"/>
-            </w:tcMar>
-            <w:vAlign w:val="top"/>
-          </w:tcPr>
-          <w:p>
-            <w:pPr>
-              <w:keepNext w:val="false"/>
-              <w:spacing w:after="20" w:line="260"/>
-            </w:pPr>
-            <w:r>
-              <w:rPr>
-                <w:sz w:val="18"/>
-                <w:szCs w:val="18"/>
-              </w:rPr>
-              <w:t xml:space="preserve">Opens the card checkout or records a bank transfer with proof. Emails a receipt.</w:t>
-            </w:r>
-          </w:p>
-        </w:tc>
-        <w:tc>
-          <w:tcPr>
-            <w:tcW w:type="dxa" w:w="1820"/>
-            <w:tcBorders>
-              <w:top w:val="single" w:color="C9D2DE" w:sz="4"/>
-              <w:left w:val="single" w:color="C9D2DE" w:sz="4"/>
-              <w:bottom w:val="single" w:color="C9D2DE" w:sz="4"/>
-              <w:right w:val="single" w:color="C9D2DE" w:sz="4"/>
-            </w:tcBorders>
-            <w:shd w:fill="F7F9FC" w:color="auto" w:val="clear"/>
             <w:tcMar>
               <w:top w:type="dxa" w:w="50"/>
               <w:left w:type="dxa" w:w="90"/>
@@ -9607,33 +9469,33 @@
                 <w:sz w:val="18"/>
                 <w:szCs w:val="18"/>
               </w:rPr>
-              <w:t xml:space="preserve">• The demo card checkout (4242 4242 4242 4242) is used until a real gateway is switched on. Demo payment links are never sent to real clients.</w:t>
-            </w:r>
-          </w:p>
-          <w:p>
-            <w:pPr>
-              <w:keepNext w:val="false"/>
-              <w:spacing w:after="20" w:line="260"/>
-            </w:pPr>
-            <w:r>
-              <w:rPr>
-                <w:sz w:val="18"/>
-                <w:szCs w:val="18"/>
-              </w:rPr>
-              <w:t xml:space="preserve">• A quote can only be edited as a new revision once it has been sent, so the client and ARAL always see the same version.</w:t>
-            </w:r>
-          </w:p>
-          <w:p>
-            <w:pPr>
-              <w:keepNext w:val="false"/>
-              <w:spacing w:after="20" w:line="260"/>
-            </w:pPr>
-            <w:r>
-              <w:rPr>
-                <w:sz w:val="18"/>
-                <w:szCs w:val="18"/>
-              </w:rPr>
-              <w:t xml:space="preserve">• If prices change, quotes already sent keep their original price until they expire.</w:t>
+              <w:t xml:space="preserve">• Demo mode: the checkout accepts the test card 4242 4242 4242 4242 and shows a 'DEMO, no real payment' banner. Stripe replaces it by changing settings only.</w:t>
+            </w:r>
+          </w:p>
+          <w:p>
+            <w:pPr>
+              <w:keepNext w:val="false"/>
+              <w:spacing w:after="20" w:line="260"/>
+            </w:pPr>
+            <w:r>
+              <w:rPr>
+                <w:sz w:val="18"/>
+                <w:szCs w:val="18"/>
+              </w:rPr>
+              <w:t xml:space="preserve">• A sent quote is never edited: a change creates a revision, so the client and ARAL always see the same version.</w:t>
+            </w:r>
+          </w:p>
+          <w:p>
+            <w:pPr>
+              <w:keepNext w:val="false"/>
+              <w:spacing w:after="20" w:line="260"/>
+            </w:pPr>
+            <w:r>
+              <w:rPr>
+                <w:sz w:val="18"/>
+                <w:szCs w:val="18"/>
+              </w:rPr>
+              <w:t xml:space="preserve">• Links in emails use the app's public address (BASE_URL). If it is wrong, links open a 'page not found' and the dashboard shows a red warning with the right value.</w:t>
             </w:r>
           </w:p>
         </w:tc>
@@ -9677,7 +9539,7 @@
                 <w:sz w:val="18"/>
                 <w:szCs w:val="18"/>
               </w:rPr>
-              <w:t xml:space="preserve">• Average time from enquiry to accepted quote</w:t>
+              <w:t xml:space="preserve">• Days from acceptance to signature and payment</w:t>
             </w:r>
           </w:p>
           <w:p>
@@ -9880,7 +9742,7 @@
       <w:r>
         <w:drawing>
           <wp:inline distT="0" distB="0" distL="0" distR="0">
-            <wp:extent cx="5715000" cy="1914525"/>
+            <wp:extent cx="5715000" cy="2028825"/>
             <wp:effectExtent t="0" r="0" b="0" l="0"/>
             <wp:docPr id="5" name="operations.png" descr="operations.png" title="operations.png"/>
             <wp:cNvGraphicFramePr>
@@ -9905,7 +9767,7 @@
                   <pic:spPr bwMode="auto">
                     <a:xfrm>
                       <a:off x="0" y="0"/>
-                      <a:ext cx="5715000" cy="1914525"/>
+                      <a:ext cx="5715000" cy="2028825"/>
                     </a:xfrm>
                     <a:prstGeom prst="rect">
                       <a:avLst/>
@@ -10187,7 +10049,7 @@
                 <w:sz w:val="18"/>
                 <w:szCs w:val="18"/>
               </w:rPr>
-              <w:t xml:space="preserve">Confirm prerequisites</w:t>
+              <w:t xml:space="preserve">Check the job is ready</w:t>
             </w:r>
           </w:p>
         </w:tc>
@@ -10249,7 +10111,7 @@
                 <w:sz w:val="18"/>
                 <w:szCs w:val="18"/>
               </w:rPr>
-              <w:t xml:space="preserve">Shows the checklist from the quote. A job cannot be confirmed until access details are filled in.</w:t>
+              <w:t xml:space="preserve">The job page shows the next step. Access notes and the client's prerequisites (AC, DEWA, keys) come from the quote.</w:t>
             </w:r>
           </w:p>
         </w:tc>
@@ -10349,7 +10211,7 @@
                 <w:sz w:val="18"/>
                 <w:szCs w:val="18"/>
               </w:rPr>
-              <w:t xml:space="preserve">Assign an inspector</w:t>
+              <w:t xml:space="preserve">Choose date and inspector</w:t>
             </w:r>
           </w:p>
         </w:tc>
@@ -10413,7 +10275,7 @@
                 <w:sz w:val="18"/>
                 <w:szCs w:val="18"/>
               </w:rPr>
-              <w:t xml:space="preserve">Suggests inspectors who cover the area and are free. Blocks anyone whose licence, insurance or agreement has expired.</w:t>
+              <w:t xml:space="preserve">Lists inspectors with their status. Blocks anyone with an expired licence, insurance or agreement, or already booked at that time.</w:t>
             </w:r>
           </w:p>
         </w:tc>
@@ -10445,7 +10307,7 @@
                 <w:sz w:val="18"/>
                 <w:szCs w:val="18"/>
               </w:rPr>
-              <w:t xml:space="preserve">Scheduled</w:t>
+              <w:t xml:space="preserve">Paid</w:t>
             </w:r>
           </w:p>
         </w:tc>
@@ -10574,7 +10436,7 @@
                 <w:sz w:val="18"/>
                 <w:szCs w:val="18"/>
               </w:rPr>
-              <w:t xml:space="preserve">Reserves a free toolset for the slot. Blocks equipment that is past its calibration date.</w:t>
+              <w:t xml:space="preserve">Adds a free thermal camera automatically for services that need one. Blocks equipment past its calibration date.</w:t>
             </w:r>
           </w:p>
         </w:tc>
@@ -10674,7 +10536,7 @@
                 <w:sz w:val="18"/>
                 <w:szCs w:val="18"/>
               </w:rPr>
-              <w:t xml:space="preserve">Confirm with the client</w:t>
+              <w:t xml:space="preserve">Confirm and show in the calendar</w:t>
             </w:r>
           </w:p>
         </w:tc>
@@ -10738,7 +10600,7 @@
                 <w:sz w:val="18"/>
                 <w:szCs w:val="18"/>
               </w:rPr>
-              <w:t xml:space="preserve">Sends the confirmation, then a reminder the day before with the prerequisites again.</w:t>
+              <w:t xml:space="preserve">Sends both an .ics invite. The visit appears in the week calendar (Monday to Sunday), in 'Coming up' and in the Outlook / Google feed.</w:t>
             </w:r>
           </w:p>
         </w:tc>
@@ -10837,7 +10699,7 @@
                 <w:sz w:val="18"/>
                 <w:szCs w:val="18"/>
               </w:rPr>
-              <w:t xml:space="preserve">Inspector checks in</w:t>
+              <w:t xml:space="preserve">Inspector arrives</w:t>
             </w:r>
           </w:p>
         </w:tc>
@@ -10899,7 +10761,7 @@
                 <w:sz w:val="18"/>
                 <w:szCs w:val="18"/>
               </w:rPr>
-              <w:t xml:space="preserve">Records arrival time and GPS. This is when the SLA clock starts.</w:t>
+              <w:t xml:space="preserve">'I'm on site' starts the report clock (SLA from property access).</w:t>
             </w:r>
           </w:p>
         </w:tc>
@@ -10930,7 +10792,7 @@
                 <w:sz w:val="18"/>
                 <w:szCs w:val="18"/>
               </w:rPr>
-              <w:t xml:space="preserve">In progress / Access failed</w:t>
+              <w:t xml:space="preserve">In progress</w:t>
             </w:r>
           </w:p>
         </w:tc>
@@ -11063,33 +10925,33 @@
                 <w:sz w:val="18"/>
                 <w:szCs w:val="18"/>
               </w:rPr>
-              <w:t xml:space="preserve">• Rescheduling by the client with less than 24 hours' notice is recorded, so the fee in the terms can be charged.</w:t>
-            </w:r>
-          </w:p>
-          <w:p>
-            <w:pPr>
-              <w:keepNext w:val="false"/>
-              <w:spacing w:after="20" w:line="260"/>
-            </w:pPr>
-            <w:r>
-              <w:rPr>
-                <w:sz w:val="18"/>
-                <w:szCs w:val="18"/>
-              </w:rPr>
-              <w:t xml:space="preserve">• If no inspector is available within the SLA, the Admin sees a warning before confirming the date with the client.</w:t>
-            </w:r>
-          </w:p>
-          <w:p>
-            <w:pPr>
-              <w:keepNext w:val="false"/>
-              <w:spacing w:after="20" w:line="260"/>
-            </w:pPr>
-            <w:r>
-              <w:rPr>
-                <w:sz w:val="18"/>
-                <w:szCs w:val="18"/>
-              </w:rPr>
-              <w:t xml:space="preserve">• Bank jobs uploaded in bulk are scheduled from one screen, grouped by area.</w:t>
+              <w:t xml:space="preserve">• No inspectors yet, or an inspector's login not linked to their inspector record: the app shows a warning with a link to Settings.</w:t>
+            </w:r>
+          </w:p>
+          <w:p>
+            <w:pPr>
+              <w:keepNext w:val="false"/>
+              <w:spacing w:after="20" w:line="260"/>
+            </w:pPr>
+            <w:r>
+              <w:rPr>
+                <w:sz w:val="18"/>
+                <w:szCs w:val="18"/>
+              </w:rPr>
+              <w:t xml:space="preserve">• Rescheduling sends a new invite and frees the old equipment booking; the history keeps both dates.</w:t>
+            </w:r>
+          </w:p>
+          <w:p>
+            <w:pPr>
+              <w:keepNext w:val="false"/>
+              <w:spacing w:after="20" w:line="260"/>
+            </w:pPr>
+            <w:r>
+              <w:rPr>
+                <w:sz w:val="18"/>
+                <w:szCs w:val="18"/>
+              </w:rPr>
+              <w:t xml:space="preserve">• Bank and company jobs on credit can be scheduled as soon as the agreement is signed.</w:t>
             </w:r>
           </w:p>
         </w:tc>
@@ -11146,7 +11008,7 @@
                 <w:sz w:val="18"/>
                 <w:szCs w:val="18"/>
               </w:rPr>
-              <w:t xml:space="preserve">• Inspector utilisation per week</w:t>
+              <w:t xml:space="preserve">• Inspector workload per week (calendar)</w:t>
             </w:r>
           </w:p>
         </w:tc>
@@ -11336,7 +11198,7 @@
       <w:r>
         <w:drawing>
           <wp:inline distT="0" distB="0" distL="0" distR="0">
-            <wp:extent cx="5715000" cy="2333625"/>
+            <wp:extent cx="5715000" cy="2028825"/>
             <wp:effectExtent t="0" r="0" b="0" l="0"/>
             <wp:docPr id="6" name="execution.png" descr="execution.png" title="execution.png"/>
             <wp:cNvGraphicFramePr>
@@ -11361,7 +11223,7 @@
                   <pic:spPr bwMode="auto">
                     <a:xfrm>
                       <a:off x="0" y="0"/>
-                      <a:ext cx="5715000" cy="2333625"/>
+                      <a:ext cx="5715000" cy="2028825"/>
                     </a:xfrm>
                     <a:prstGeom prst="rect">
                       <a:avLst/>
@@ -11705,7 +11567,7 @@
                 <w:sz w:val="18"/>
                 <w:szCs w:val="18"/>
               </w:rPr>
-              <w:t xml:space="preserve">Pre-fills the inspector, property and date. Takes the cover photo.</w:t>
+              <w:t xml:space="preserve">Pre-fills the date and time in. Saves as you type.</w:t>
             </w:r>
           </w:p>
         </w:tc>
@@ -11805,7 +11667,7 @@
                 <w:sz w:val="18"/>
                 <w:szCs w:val="18"/>
               </w:rPr>
-              <w:t xml:space="preserve">Inspect room by room</w:t>
+              <w:t xml:space="preserve">Systems and rooms</w:t>
             </w:r>
           </w:p>
         </w:tc>
@@ -11869,7 +11731,7 @@
                 <w:sz w:val="18"/>
                 <w:szCs w:val="18"/>
               </w:rPr>
-              <w:t xml:space="preserve">Offers ready-made findings for each item. Saves everything on the phone and syncs when there is signal.</w:t>
+              <w:t xml:space="preserve">Each section has its own items and picklists (e.g. AC type, condensate drain; tile materials only in rooms). Ready-made findings for every item.</w:t>
             </w:r>
           </w:p>
         </w:tc>
@@ -11968,7 +11830,7 @@
                 <w:sz w:val="18"/>
                 <w:szCs w:val="18"/>
               </w:rPr>
-              <w:t xml:space="preserve">Submit the draft</w:t>
+              <w:t xml:space="preserve">Photos, videos, attachments</w:t>
             </w:r>
           </w:p>
         </w:tc>
@@ -12030,7 +11892,7 @@
                 <w:sz w:val="18"/>
                 <w:szCs w:val="18"/>
               </w:rPr>
-              <w:t xml:space="preserve">Warns about rooms with no entry and photos not linked to a finding. Locks the draft for the inspector.</w:t>
+              <w:t xml:space="preserve">Photos are marked up and reduced on the phone; videos up to 60 s. Lab results, floor plans or DEWA bills are added as attachments. Everything works offline and syncs later.</w:t>
             </w:r>
           </w:p>
         </w:tc>
@@ -12061,7 +11923,7 @@
                 <w:sz w:val="18"/>
                 <w:szCs w:val="18"/>
               </w:rPr>
-              <w:t xml:space="preserve">Under review</w:t>
+              <w:t xml:space="preserve">In progress</w:t>
             </w:r>
           </w:p>
         </w:tc>
@@ -12130,7 +11992,7 @@
                 <w:sz w:val="18"/>
                 <w:szCs w:val="18"/>
               </w:rPr>
-              <w:t xml:space="preserve">Technical review</w:t>
+              <w:t xml:space="preserve">Submit the draft</w:t>
             </w:r>
           </w:p>
         </w:tc>
@@ -12162,7 +12024,7 @@
                 <w:sz w:val="18"/>
                 <w:szCs w:val="18"/>
               </w:rPr>
-              <w:t xml:space="preserve">Technical Manager</w:t>
+              <w:t xml:space="preserve">Inspector</w:t>
             </w:r>
           </w:p>
         </w:tc>
@@ -12194,7 +12056,7 @@
                 <w:sz w:val="18"/>
                 <w:szCs w:val="18"/>
               </w:rPr>
-              <w:t xml:space="preserve">Shows every finding with its photos; the reviewer can change severity or wording, with each change logged.</w:t>
+              <w:t xml:space="preserve">Blocks submission if the date or time is missing, or a critical finding has no photo. Locks the draft for the inspector.</w:t>
             </w:r>
           </w:p>
         </w:tc>
@@ -12226,7 +12088,7 @@
                 <w:sz w:val="18"/>
                 <w:szCs w:val="18"/>
               </w:rPr>
-              <w:t xml:space="preserve">Approved / Returned</w:t>
+              <w:t xml:space="preserve">Under review</w:t>
             </w:r>
           </w:p>
         </w:tc>
@@ -12293,7 +12155,7 @@
                 <w:sz w:val="18"/>
                 <w:szCs w:val="18"/>
               </w:rPr>
-              <w:t xml:space="preserve">Issue the report</w:t>
+              <w:t xml:space="preserve">Technical review</w:t>
             </w:r>
           </w:p>
         </w:tc>
@@ -12324,7 +12186,7 @@
                 <w:sz w:val="18"/>
                 <w:szCs w:val="18"/>
               </w:rPr>
-              <w:t xml:space="preserve">System</w:t>
+              <w:t xml:space="preserve">Technical Manager</w:t>
             </w:r>
           </w:p>
         </w:tc>
@@ -12355,7 +12217,7 @@
                 <w:sz w:val="18"/>
                 <w:szCs w:val="18"/>
               </w:rPr>
-              <w:t xml:space="preserve">Gives the report number (RPT-2026-00001), builds the PDF with contents and summary, saves it to Google Drive and emails the client a link.</w:t>
+              <w:t xml:space="preserve">The reviewer can correct wording directly, preview the PDF, then approve.</w:t>
             </w:r>
           </w:p>
         </w:tc>
@@ -12386,7 +12248,7 @@
                 <w:sz w:val="18"/>
                 <w:szCs w:val="18"/>
               </w:rPr>
-              <w:t xml:space="preserve">Report issued</w:t>
+              <w:t xml:space="preserve">Under review</w:t>
             </w:r>
           </w:p>
         </w:tc>
@@ -12455,6 +12317,169 @@
                 <w:sz w:val="18"/>
                 <w:szCs w:val="18"/>
               </w:rPr>
+              <w:t xml:space="preserve">Issue the report</w:t>
+            </w:r>
+          </w:p>
+        </w:tc>
+        <w:tc>
+          <w:tcPr>
+            <w:tcW w:type="dxa" w:w="1213"/>
+            <w:tcBorders>
+              <w:top w:val="single" w:color="C9D2DE" w:sz="4"/>
+              <w:left w:val="single" w:color="C9D2DE" w:sz="4"/>
+              <w:bottom w:val="single" w:color="C9D2DE" w:sz="4"/>
+              <w:right w:val="single" w:color="C9D2DE" w:sz="4"/>
+            </w:tcBorders>
+            <w:shd w:fill="F7F9FC" w:color="auto" w:val="clear"/>
+            <w:tcMar>
+              <w:top w:type="dxa" w:w="50"/>
+              <w:left w:type="dxa" w:w="90"/>
+              <w:bottom w:type="dxa" w:w="50"/>
+              <w:right w:type="dxa" w:w="90"/>
+            </w:tcMar>
+            <w:vAlign w:val="top"/>
+          </w:tcPr>
+          <w:p>
+            <w:pPr>
+              <w:keepNext w:val="false"/>
+              <w:spacing w:after="20" w:line="260"/>
+            </w:pPr>
+            <w:r>
+              <w:rPr>
+                <w:sz w:val="18"/>
+                <w:szCs w:val="18"/>
+              </w:rPr>
+              <w:t xml:space="preserve">Technical Manager</w:t>
+            </w:r>
+          </w:p>
+        </w:tc>
+        <w:tc>
+          <w:tcPr>
+            <w:tcW w:type="dxa" w:w="4852"/>
+            <w:tcBorders>
+              <w:top w:val="single" w:color="C9D2DE" w:sz="4"/>
+              <w:left w:val="single" w:color="C9D2DE" w:sz="4"/>
+              <w:bottom w:val="single" w:color="C9D2DE" w:sz="4"/>
+              <w:right w:val="single" w:color="C9D2DE" w:sz="4"/>
+            </w:tcBorders>
+            <w:shd w:fill="F7F9FC" w:color="auto" w:val="clear"/>
+            <w:tcMar>
+              <w:top w:type="dxa" w:w="50"/>
+              <w:left w:type="dxa" w:w="90"/>
+              <w:bottom w:type="dxa" w:w="50"/>
+              <w:right w:type="dxa" w:w="90"/>
+            </w:tcMar>
+            <w:vAlign w:val="top"/>
+          </w:tcPr>
+          <w:p>
+            <w:pPr>
+              <w:keepNext w:val="false"/>
+              <w:spacing w:after="20" w:line="260"/>
+            </w:pPr>
+            <w:r>
+              <w:rPr>
+                <w:sz w:val="18"/>
+                <w:szCs w:val="18"/>
+              </w:rPr>
+              <w:t xml:space="preserve">Numbers the report (RPT-2026-00001), builds the locked PDF with contents, summary and attachments appendix, and emails it with the online report link and the attachments.</w:t>
+            </w:r>
+          </w:p>
+        </w:tc>
+        <w:tc>
+          <w:tcPr>
+            <w:tcW w:type="dxa" w:w="1820"/>
+            <w:tcBorders>
+              <w:top w:val="single" w:color="C9D2DE" w:sz="4"/>
+              <w:left w:val="single" w:color="C9D2DE" w:sz="4"/>
+              <w:bottom w:val="single" w:color="C9D2DE" w:sz="4"/>
+              <w:right w:val="single" w:color="C9D2DE" w:sz="4"/>
+            </w:tcBorders>
+            <w:shd w:fill="F7F9FC" w:color="auto" w:val="clear"/>
+            <w:tcMar>
+              <w:top w:type="dxa" w:w="50"/>
+              <w:left w:type="dxa" w:w="90"/>
+              <w:bottom w:type="dxa" w:w="50"/>
+              <w:right w:type="dxa" w:w="90"/>
+            </w:tcMar>
+            <w:vAlign w:val="top"/>
+          </w:tcPr>
+          <w:p>
+            <w:pPr>
+              <w:keepNext w:val="false"/>
+              <w:spacing w:after="20" w:line="260"/>
+            </w:pPr>
+            <w:r>
+              <w:rPr>
+                <w:sz w:val="18"/>
+                <w:szCs w:val="18"/>
+              </w:rPr>
+              <w:t xml:space="preserve">Report issued</w:t>
+            </w:r>
+          </w:p>
+        </w:tc>
+      </w:tr>
+      <w:tr>
+        <w:trPr>
+          <w:cantSplit/>
+        </w:trPr>
+        <w:tc>
+          <w:tcPr>
+            <w:tcW w:type="dxa" w:w="404"/>
+            <w:tcBorders>
+              <w:top w:val="single" w:color="C9D2DE" w:sz="4"/>
+              <w:left w:val="single" w:color="C9D2DE" w:sz="4"/>
+              <w:bottom w:val="single" w:color="C9D2DE" w:sz="4"/>
+              <w:right w:val="single" w:color="C9D2DE" w:sz="4"/>
+            </w:tcBorders>
+            <w:tcMar>
+              <w:top w:type="dxa" w:w="50"/>
+              <w:left w:type="dxa" w:w="90"/>
+              <w:bottom w:type="dxa" w:w="50"/>
+              <w:right w:type="dxa" w:w="90"/>
+            </w:tcMar>
+            <w:vAlign w:val="top"/>
+          </w:tcPr>
+          <w:p>
+            <w:pPr>
+              <w:keepNext w:val="false"/>
+              <w:spacing w:after="20" w:line="260"/>
+            </w:pPr>
+            <w:r>
+              <w:rPr>
+                <w:sz w:val="18"/>
+                <w:szCs w:val="18"/>
+              </w:rPr>
+              <w:t xml:space="preserve">7</w:t>
+            </w:r>
+          </w:p>
+        </w:tc>
+        <w:tc>
+          <w:tcPr>
+            <w:tcW w:type="dxa" w:w="1617"/>
+            <w:tcBorders>
+              <w:top w:val="single" w:color="C9D2DE" w:sz="4"/>
+              <w:left w:val="single" w:color="C9D2DE" w:sz="4"/>
+              <w:bottom w:val="single" w:color="C9D2DE" w:sz="4"/>
+              <w:right w:val="single" w:color="C9D2DE" w:sz="4"/>
+            </w:tcBorders>
+            <w:tcMar>
+              <w:top w:type="dxa" w:w="50"/>
+              <w:left w:type="dxa" w:w="90"/>
+              <w:bottom w:type="dxa" w:w="50"/>
+              <w:right w:type="dxa" w:w="90"/>
+            </w:tcMar>
+            <w:vAlign w:val="top"/>
+          </w:tcPr>
+          <w:p>
+            <w:pPr>
+              <w:keepNext w:val="false"/>
+              <w:spacing w:after="20" w:line="260"/>
+            </w:pPr>
+            <w:r>
+              <w:rPr>
+                <w:sz w:val="18"/>
+                <w:szCs w:val="18"/>
+              </w:rPr>
               <w:t xml:space="preserve">Re-inspection</w:t>
             </w:r>
           </w:p>
@@ -12468,7 +12493,6 @@
               <w:bottom w:val="single" w:color="C9D2DE" w:sz="4"/>
               <w:right w:val="single" w:color="C9D2DE" w:sz="4"/>
             </w:tcBorders>
-            <w:shd w:fill="F7F9FC" w:color="auto" w:val="clear"/>
             <w:tcMar>
               <w:top w:type="dxa" w:w="50"/>
               <w:left w:type="dxa" w:w="90"/>
@@ -12500,26 +12524,25 @@
               <w:bottom w:val="single" w:color="C9D2DE" w:sz="4"/>
               <w:right w:val="single" w:color="C9D2DE" w:sz="4"/>
             </w:tcBorders>
-            <w:shd w:fill="F7F9FC" w:color="auto" w:val="clear"/>
-            <w:tcMar>
-              <w:top w:type="dxa" w:w="50"/>
-              <w:left w:type="dxa" w:w="90"/>
-              <w:bottom w:type="dxa" w:w="50"/>
-              <w:right w:type="dxa" w:w="90"/>
-            </w:tcMar>
-            <w:vAlign w:val="top"/>
-          </w:tcPr>
-          <w:p>
-            <w:pPr>
-              <w:keepNext w:val="false"/>
-              <w:spacing w:after="20" w:line="260"/>
-            </w:pPr>
-            <w:r>
-              <w:rPr>
-                <w:sz w:val="18"/>
-                <w:szCs w:val="18"/>
-              </w:rPr>
-              <w:t xml:space="preserve">Creates the linked re-inspection job with the original findings ready to tick off.</w:t>
+            <w:tcMar>
+              <w:top w:type="dxa" w:w="50"/>
+              <w:left w:type="dxa" w:w="90"/>
+              <w:bottom w:type="dxa" w:w="50"/>
+              <w:right w:type="dxa" w:w="90"/>
+            </w:tcMar>
+            <w:vAlign w:val="top"/>
+          </w:tcPr>
+          <w:p>
+            <w:pPr>
+              <w:keepNext w:val="false"/>
+              <w:spacing w:after="20" w:line="260"/>
+            </w:pPr>
+            <w:r>
+              <w:rPr>
+                <w:sz w:val="18"/>
+                <w:szCs w:val="18"/>
+              </w:rPr>
+              <w:t xml:space="preserve">'Book a re-inspection' on the job page.</w:t>
             </w:r>
           </w:p>
         </w:tc>
@@ -12532,26 +12555,25 @@
               <w:bottom w:val="single" w:color="C9D2DE" w:sz="4"/>
               <w:right w:val="single" w:color="C9D2DE" w:sz="4"/>
             </w:tcBorders>
-            <w:shd w:fill="F7F9FC" w:color="auto" w:val="clear"/>
-            <w:tcMar>
-              <w:top w:type="dxa" w:w="50"/>
-              <w:left w:type="dxa" w:w="90"/>
-              <w:bottom w:type="dxa" w:w="50"/>
-              <w:right w:type="dxa" w:w="90"/>
-            </w:tcMar>
-            <w:vAlign w:val="top"/>
-          </w:tcPr>
-          <w:p>
-            <w:pPr>
-              <w:keepNext w:val="false"/>
-              <w:spacing w:after="20" w:line="260"/>
-            </w:pPr>
-            <w:r>
-              <w:rPr>
-                <w:sz w:val="18"/>
-                <w:szCs w:val="18"/>
-              </w:rPr>
-              <w:t xml:space="preserve">Report issued / Re-inspection due</w:t>
+            <w:tcMar>
+              <w:top w:type="dxa" w:w="50"/>
+              <w:left w:type="dxa" w:w="90"/>
+              <w:bottom w:type="dxa" w:w="50"/>
+              <w:right w:type="dxa" w:w="90"/>
+            </w:tcMar>
+            <w:vAlign w:val="top"/>
+          </w:tcPr>
+          <w:p>
+            <w:pPr>
+              <w:keepNext w:val="false"/>
+              <w:spacing w:after="20" w:line="260"/>
+            </w:pPr>
+            <w:r>
+              <w:rPr>
+                <w:sz w:val="18"/>
+                <w:szCs w:val="18"/>
+              </w:rPr>
+              <w:t xml:space="preserve">Re-inspection due</w:t>
             </w:r>
           </w:p>
         </w:tc>
@@ -12684,33 +12706,33 @@
                 <w:sz w:val="18"/>
                 <w:szCs w:val="18"/>
               </w:rPr>
-              <w:t xml:space="preserve">• An issued report can never be edited. A correction creates version 2, and the QR page shows version 1 as replaced.</w:t>
-            </w:r>
-          </w:p>
-          <w:p>
-            <w:pPr>
-              <w:keepNext w:val="false"/>
-              <w:spacing w:after="20" w:line="260"/>
-            </w:pPr>
-            <w:r>
-              <w:rPr>
-                <w:sz w:val="18"/>
-                <w:szCs w:val="18"/>
-              </w:rPr>
-              <w:t xml:space="preserve">• If the SLA is at risk (for example 6 hours left), the job is highlighted on the dashboard for the Admin and the Technical Manager.</w:t>
-            </w:r>
-          </w:p>
-          <w:p>
-            <w:pPr>
-              <w:keepNext w:val="false"/>
-              <w:spacing w:after="20" w:line="260"/>
-            </w:pPr>
-            <w:r>
-              <w:rPr>
-                <w:sz w:val="18"/>
-                <w:szCs w:val="18"/>
-              </w:rPr>
-              <w:t xml:space="preserve">• Videos are shown in the PDF as a thumbnail with a QR code that opens them on the online report.</w:t>
+              <w:t xml:space="preserve">• An issued report is never edited. A correction creates version 2; the QR page shows the latest version.</w:t>
+            </w:r>
+          </w:p>
+          <w:p>
+            <w:pPr>
+              <w:keepNext w:val="false"/>
+              <w:spacing w:after="20" w:line="260"/>
+            </w:pPr>
+            <w:r>
+              <w:rPr>
+                <w:sz w:val="18"/>
+                <w:szCs w:val="18"/>
+              </w:rPr>
+              <w:t xml:space="preserve">• Reports past their due time are listed on the dashboard.</w:t>
+            </w:r>
+          </w:p>
+          <w:p>
+            <w:pPr>
+              <w:keepNext w:val="false"/>
+              <w:spacing w:after="20" w:line="260"/>
+            </w:pPr>
+            <w:r>
+              <w:rPr>
+                <w:sz w:val="18"/>
+                <w:szCs w:val="18"/>
+              </w:rPr>
+              <w:t xml:space="preserve">• PDF attachments are linked by QR code in the report and sent with the email; image attachments print on their own page.</w:t>
             </w:r>
           </w:p>
         </w:tc>
@@ -12741,7 +12763,7 @@
                 <w:sz w:val="18"/>
                 <w:szCs w:val="18"/>
               </w:rPr>
-              <w:t xml:space="preserve">• Reports issued within SLA (from property access)</w:t>
+              <w:t xml:space="preserve">• Reports issued on time (from property access)</w:t>
             </w:r>
           </w:p>
           <w:p>
@@ -12767,7 +12789,7 @@
                 <w:sz w:val="18"/>
                 <w:szCs w:val="18"/>
               </w:rPr>
-              <w:t xml:space="preserve">• Average findings and photos per report</w:t>
+              <w:t xml:space="preserve">• Client rating from the online report (target 4.8)</w:t>
             </w:r>
           </w:p>
         </w:tc>
@@ -12957,7 +12979,7 @@
       <w:r>
         <w:drawing>
           <wp:inline distT="0" distB="0" distL="0" distR="0">
-            <wp:extent cx="5715000" cy="1981200"/>
+            <wp:extent cx="5715000" cy="2085975"/>
             <wp:effectExtent t="0" r="0" b="0" l="0"/>
             <wp:docPr id="7" name="invoicing.png" descr="invoicing.png" title="invoicing.png"/>
             <wp:cNvGraphicFramePr>
@@ -12982,7 +13004,7 @@
                   <pic:spPr bwMode="auto">
                     <a:xfrm>
                       <a:off x="0" y="0"/>
-                      <a:ext cx="5715000" cy="1981200"/>
+                      <a:ext cx="5715000" cy="2085975"/>
                     </a:xfrm>
                     <a:prstGeom prst="rect">
                       <a:avLst/>
@@ -13326,7 +13348,7 @@
                 <w:sz w:val="18"/>
                 <w:szCs w:val="18"/>
               </w:rPr>
-              <w:t xml:space="preserve">Numbers the invoice (INV-2026-00001). Shows 'Tax Invoice' with 5% VAT once VAT registration is switched on.</w:t>
+              <w:t xml:space="preserve">Issues the invoice when the report is issued (Tax Invoice with 5% VAT once registered).</w:t>
             </w:r>
           </w:p>
         </w:tc>
@@ -13458,7 +13480,7 @@
                 <w:sz w:val="18"/>
                 <w:szCs w:val="18"/>
               </w:rPr>
-              <w:t xml:space="preserve">Accountant</w:t>
+              <w:t xml:space="preserve">System</w:t>
             </w:r>
           </w:p>
         </w:tc>
@@ -13490,7 +13512,7 @@
                 <w:sz w:val="18"/>
                 <w:szCs w:val="18"/>
               </w:rPr>
-              <w:t xml:space="preserve">Emails the PDF with a card payment link (live gateway only) and bank details.</w:t>
+              <w:t xml:space="preserve">Emails the invoice with a card payment link and QR code.</w:t>
             </w:r>
           </w:p>
         </w:tc>
@@ -13651,7 +13673,7 @@
                 <w:sz w:val="18"/>
                 <w:szCs w:val="18"/>
               </w:rPr>
-              <w:t xml:space="preserve">Matches card payments automatically. Bank transfers and cheques are recorded with proof.</w:t>
+              <w:t xml:space="preserve">Card payments are matched automatically; transfers, cheques and cash are recorded with a receipt.</w:t>
             </w:r>
           </w:p>
         </w:tc>
@@ -13682,7 +13704,7 @@
                 <w:sz w:val="18"/>
                 <w:szCs w:val="18"/>
               </w:rPr>
-              <w:t xml:space="preserve">Paid / Part paid</w:t>
+              <w:t xml:space="preserve">Paid / Closed</w:t>
             </w:r>
           </w:p>
         </w:tc>
@@ -13976,7 +13998,7 @@
                 <w:sz w:val="18"/>
                 <w:szCs w:val="18"/>
               </w:rPr>
-              <w:t xml:space="preserve">Becomes payable when the report is issued and (for individuals) the job is paid. Goes on the monthly commission statement.</w:t>
+              <w:t xml:space="preserve">Becomes payable when the report is issued. Bonuses can be added.</w:t>
             </w:r>
           </w:p>
         </w:tc>
@@ -14140,7 +14162,7 @@
                 <w:sz w:val="18"/>
                 <w:szCs w:val="18"/>
               </w:rPr>
-              <w:t xml:space="preserve">Produces the statement PDF and an Excel payout list. Marks commissions as paid.</w:t>
+              <w:t xml:space="preserve">Statement PDF per inspector and month; tick and mark as paid; Excel export.</w:t>
             </w:r>
           </w:p>
         </w:tc>
@@ -14305,33 +14327,33 @@
                 <w:sz w:val="18"/>
                 <w:szCs w:val="18"/>
               </w:rPr>
-              <w:t xml:space="preserve">• Before VAT registration, invoices carry no VAT. Turning VAT on changes new invoices only.</w:t>
-            </w:r>
-          </w:p>
-          <w:p>
-            <w:pPr>
-              <w:keepNext w:val="false"/>
-              <w:spacing w:after="20" w:line="260"/>
-            </w:pPr>
-            <w:r>
-              <w:rPr>
-                <w:sz w:val="18"/>
-                <w:szCs w:val="18"/>
-              </w:rPr>
-              <w:t xml:space="preserve">• A cancelled job after payment is refunded through a credit note; the inspector's commission is cancelled if no visit took place.</w:t>
-            </w:r>
-          </w:p>
-          <w:p>
-            <w:pPr>
-              <w:keepNext w:val="false"/>
-              <w:spacing w:after="20" w:line="260"/>
-            </w:pPr>
-            <w:r>
-              <w:rPr>
-                <w:sz w:val="18"/>
-                <w:szCs w:val="18"/>
-              </w:rPr>
-              <w:t xml:space="preserve">• Data is kept in a structured form so it can be exported for the UAE e-invoicing system when ARAL is required to join.</w:t>
+              <w:t xml:space="preserve">• Before VAT registration invoices carry no VAT. The dashboard warns as the 12-month turnover approaches AED 375,000.</w:t>
+            </w:r>
+          </w:p>
+          <w:p>
+            <w:pPr>
+              <w:keepNext w:val="false"/>
+              <w:spacing w:after="20" w:line="260"/>
+            </w:pPr>
+            <w:r>
+              <w:rPr>
+                <w:sz w:val="18"/>
+                <w:szCs w:val="18"/>
+              </w:rPr>
+              <w:t xml:space="preserve">• A cancelled job releases its equipment booking and voids the inspector's commission.</w:t>
+            </w:r>
+          </w:p>
+          <w:p>
+            <w:pPr>
+              <w:keepNext w:val="false"/>
+              <w:spacing w:after="20" w:line="260"/>
+            </w:pPr>
+            <w:r>
+              <w:rPr>
+                <w:sz w:val="18"/>
+                <w:szCs w:val="18"/>
+              </w:rPr>
+              <w:t xml:space="preserve">• An invoice with no payments can be cancelled; otherwise a credit note is used.</w:t>
             </w:r>
           </w:p>
         </w:tc>
@@ -14805,7 +14827,7 @@
                 <w:sz w:val="18"/>
                 <w:szCs w:val="18"/>
               </w:rPr>
-              <w:t xml:space="preserve">Client accepted; agreement sent</w:t>
+              <w:t xml:space="preserve">Client accepted; signing link emailed</w:t>
             </w:r>
           </w:p>
         </w:tc>
@@ -14836,7 +14858,7 @@
                 <w:sz w:val="18"/>
                 <w:szCs w:val="18"/>
               </w:rPr>
-              <w:t xml:space="preserve">Client</w:t>
+              <w:t xml:space="preserve">Client (or the office records a paper signature)</w:t>
             </w:r>
           </w:p>
         </w:tc>
@@ -14875,7 +14897,7 @@
                 <w:sz w:val="18"/>
                 <w:szCs w:val="18"/>
               </w:rPr>
-              <w:t xml:space="preserve">Agreement signed</w:t>
+              <w:t xml:space="preserve">Awaiting payment</w:t>
             </w:r>
           </w:p>
         </w:tc>
@@ -14939,7 +14961,7 @@
                 <w:sz w:val="18"/>
                 <w:szCs w:val="18"/>
               </w:rPr>
-              <w:t xml:space="preserve">Client or Accountant</w:t>
+              <w:t xml:space="preserve">Client, or the office (Pay by card / Record payment)</w:t>
             </w:r>
           </w:p>
         </w:tc>
@@ -15008,7 +15030,7 @@
                 <w:sz w:val="18"/>
                 <w:szCs w:val="18"/>
               </w:rPr>
-              <w:t xml:space="preserve">Paid in full or the deposit (or on credit terms)</w:t>
+              <w:t xml:space="preserve">Paid; inspection created, waiting to be scheduled</w:t>
             </w:r>
           </w:p>
         </w:tc>
@@ -16055,6 +16077,1700 @@
                 <w:szCs w:val="18"/>
               </w:rPr>
               <w:t xml:space="preserve">Accountant</w:t>
+            </w:r>
+          </w:p>
+        </w:tc>
+      </w:tr>
+    </w:tbl>
+    <w:p>
+      <w:pPr>
+        <w:pStyle w:val="Heading1"/>
+        <w:pageBreakBefore/>
+      </w:pPr>
+      <w:r>
+        <w:t xml:space="preserve">Before you go live</w:t>
+      </w:r>
+    </w:p>
+    <w:p>
+      <w:pPr>
+        <w:spacing w:after="120" w:line="300"/>
+      </w:pPr>
+      <w:r>
+        <w:t xml:space="preserve">These settings decide whether emails, links and the phone app work for real clients. The dashboard shows the open items to the Super Admin.</w:t>
+      </w:r>
+    </w:p>
+    <w:tbl>
+      <w:tblPr>
+        <w:tblW w:type="dxa" w:w="9906"/>
+        <w:tblBorders>
+          <w:top w:val="single" w:color="auto" w:sz="4"/>
+          <w:left w:val="single" w:color="auto" w:sz="4"/>
+          <w:bottom w:val="single" w:color="auto" w:sz="4"/>
+          <w:right w:val="single" w:color="auto" w:sz="4"/>
+          <w:insideH w:val="single" w:color="auto" w:sz="4"/>
+          <w:insideV w:val="single" w:color="auto" w:sz="4"/>
+        </w:tblBorders>
+      </w:tblPr>
+      <w:tblGrid>
+        <w:gridCol w:w="396"/>
+        <w:gridCol w:w="3764"/>
+        <w:gridCol w:w="2179"/>
+        <w:gridCol w:w="3567"/>
+      </w:tblGrid>
+      <w:tr>
+        <w:trPr>
+          <w:tblHeader/>
+        </w:trPr>
+        <w:tc>
+          <w:tcPr>
+            <w:tcW w:type="dxa" w:w="396"/>
+            <w:tcBorders>
+              <w:top w:val="single" w:color="C9D2DE" w:sz="4"/>
+              <w:left w:val="single" w:color="C9D2DE" w:sz="4"/>
+              <w:bottom w:val="single" w:color="C9D2DE" w:sz="4"/>
+              <w:right w:val="single" w:color="C9D2DE" w:sz="4"/>
+            </w:tcBorders>
+            <w:shd w:fill="0A1F4A" w:color="auto" w:val="clear"/>
+            <w:tcMar>
+              <w:top w:type="dxa" w:w="50"/>
+              <w:left w:type="dxa" w:w="90"/>
+              <w:bottom w:type="dxa" w:w="50"/>
+              <w:right w:type="dxa" w:w="90"/>
+            </w:tcMar>
+            <w:vAlign w:val="top"/>
+          </w:tcPr>
+          <w:p>
+            <w:pPr>
+              <w:keepNext w:val="false"/>
+              <w:spacing w:after="20" w:line="260"/>
+            </w:pPr>
+            <w:r>
+              <w:rPr>
+                <w:b/>
+                <w:bCs/>
+                <w:color w:val="FFFFFF"/>
+                <w:sz w:val="18"/>
+                <w:szCs w:val="18"/>
+              </w:rPr>
+              <w:t xml:space="preserve">#</w:t>
+            </w:r>
+          </w:p>
+        </w:tc>
+        <w:tc>
+          <w:tcPr>
+            <w:tcW w:type="dxa" w:w="3764"/>
+            <w:tcBorders>
+              <w:top w:val="single" w:color="C9D2DE" w:sz="4"/>
+              <w:left w:val="single" w:color="C9D2DE" w:sz="4"/>
+              <w:bottom w:val="single" w:color="C9D2DE" w:sz="4"/>
+              <w:right w:val="single" w:color="C9D2DE" w:sz="4"/>
+            </w:tcBorders>
+            <w:shd w:fill="0A1F4A" w:color="auto" w:val="clear"/>
+            <w:tcMar>
+              <w:top w:type="dxa" w:w="50"/>
+              <w:left w:type="dxa" w:w="90"/>
+              <w:bottom w:type="dxa" w:w="50"/>
+              <w:right w:type="dxa" w:w="90"/>
+            </w:tcMar>
+            <w:vAlign w:val="top"/>
+          </w:tcPr>
+          <w:p>
+            <w:pPr>
+              <w:keepNext w:val="false"/>
+              <w:spacing w:after="20" w:line="260"/>
+            </w:pPr>
+            <w:r>
+              <w:rPr>
+                <w:b/>
+                <w:bCs/>
+                <w:color w:val="FFFFFF"/>
+                <w:sz w:val="18"/>
+                <w:szCs w:val="18"/>
+              </w:rPr>
+              <w:t xml:space="preserve">Setting</w:t>
+            </w:r>
+          </w:p>
+        </w:tc>
+        <w:tc>
+          <w:tcPr>
+            <w:tcW w:type="dxa" w:w="2179"/>
+            <w:tcBorders>
+              <w:top w:val="single" w:color="C9D2DE" w:sz="4"/>
+              <w:left w:val="single" w:color="C9D2DE" w:sz="4"/>
+              <w:bottom w:val="single" w:color="C9D2DE" w:sz="4"/>
+              <w:right w:val="single" w:color="C9D2DE" w:sz="4"/>
+            </w:tcBorders>
+            <w:shd w:fill="0A1F4A" w:color="auto" w:val="clear"/>
+            <w:tcMar>
+              <w:top w:type="dxa" w:w="50"/>
+              <w:left w:type="dxa" w:w="90"/>
+              <w:bottom w:type="dxa" w:w="50"/>
+              <w:right w:type="dxa" w:w="90"/>
+            </w:tcMar>
+            <w:vAlign w:val="top"/>
+          </w:tcPr>
+          <w:p>
+            <w:pPr>
+              <w:keepNext w:val="false"/>
+              <w:spacing w:after="20" w:line="260"/>
+            </w:pPr>
+            <w:r>
+              <w:rPr>
+                <w:b/>
+                <w:bCs/>
+                <w:color w:val="FFFFFF"/>
+                <w:sz w:val="18"/>
+                <w:szCs w:val="18"/>
+              </w:rPr>
+              <w:t xml:space="preserve">Where</w:t>
+            </w:r>
+          </w:p>
+        </w:tc>
+        <w:tc>
+          <w:tcPr>
+            <w:tcW w:type="dxa" w:w="3567"/>
+            <w:tcBorders>
+              <w:top w:val="single" w:color="C9D2DE" w:sz="4"/>
+              <w:left w:val="single" w:color="C9D2DE" w:sz="4"/>
+              <w:bottom w:val="single" w:color="C9D2DE" w:sz="4"/>
+              <w:right w:val="single" w:color="C9D2DE" w:sz="4"/>
+            </w:tcBorders>
+            <w:shd w:fill="0A1F4A" w:color="auto" w:val="clear"/>
+            <w:tcMar>
+              <w:top w:type="dxa" w:w="50"/>
+              <w:left w:type="dxa" w:w="90"/>
+              <w:bottom w:type="dxa" w:w="50"/>
+              <w:right w:type="dxa" w:w="90"/>
+            </w:tcMar>
+            <w:vAlign w:val="top"/>
+          </w:tcPr>
+          <w:p>
+            <w:pPr>
+              <w:keepNext w:val="false"/>
+              <w:spacing w:after="20" w:line="260"/>
+            </w:pPr>
+            <w:r>
+              <w:rPr>
+                <w:b/>
+                <w:bCs/>
+                <w:color w:val="FFFFFF"/>
+                <w:sz w:val="18"/>
+                <w:szCs w:val="18"/>
+              </w:rPr>
+              <w:t xml:space="preserve">Why it matters</w:t>
+            </w:r>
+          </w:p>
+        </w:tc>
+      </w:tr>
+      <w:tr>
+        <w:trPr>
+          <w:cantSplit/>
+        </w:trPr>
+        <w:tc>
+          <w:tcPr>
+            <w:tcW w:type="dxa" w:w="396"/>
+            <w:tcBorders>
+              <w:top w:val="single" w:color="C9D2DE" w:sz="4"/>
+              <w:left w:val="single" w:color="C9D2DE" w:sz="4"/>
+              <w:bottom w:val="single" w:color="C9D2DE" w:sz="4"/>
+              <w:right w:val="single" w:color="C9D2DE" w:sz="4"/>
+            </w:tcBorders>
+            <w:tcMar>
+              <w:top w:type="dxa" w:w="50"/>
+              <w:left w:type="dxa" w:w="90"/>
+              <w:bottom w:type="dxa" w:w="50"/>
+              <w:right w:type="dxa" w:w="90"/>
+            </w:tcMar>
+            <w:vAlign w:val="top"/>
+          </w:tcPr>
+          <w:p>
+            <w:pPr>
+              <w:keepNext w:val="false"/>
+              <w:spacing w:after="20" w:line="260"/>
+            </w:pPr>
+            <w:r>
+              <w:rPr>
+                <w:sz w:val="18"/>
+                <w:szCs w:val="18"/>
+              </w:rPr>
+              <w:t xml:space="preserve">1</w:t>
+            </w:r>
+          </w:p>
+        </w:tc>
+        <w:tc>
+          <w:tcPr>
+            <w:tcW w:type="dxa" w:w="3764"/>
+            <w:tcBorders>
+              <w:top w:val="single" w:color="C9D2DE" w:sz="4"/>
+              <w:left w:val="single" w:color="C9D2DE" w:sz="4"/>
+              <w:bottom w:val="single" w:color="C9D2DE" w:sz="4"/>
+              <w:right w:val="single" w:color="C9D2DE" w:sz="4"/>
+            </w:tcBorders>
+            <w:tcMar>
+              <w:top w:type="dxa" w:w="50"/>
+              <w:left w:type="dxa" w:w="90"/>
+              <w:bottom w:type="dxa" w:w="50"/>
+              <w:right w:type="dxa" w:w="90"/>
+            </w:tcMar>
+            <w:vAlign w:val="top"/>
+          </w:tcPr>
+          <w:p>
+            <w:pPr>
+              <w:keepNext w:val="false"/>
+              <w:spacing w:after="20" w:line="260"/>
+            </w:pPr>
+            <w:r>
+              <w:rPr>
+                <w:rFonts w:ascii="Consolas" w:cs="Consolas" w:eastAsia="Consolas" w:hAnsi="Consolas"/>
+                <w:color w:val="0B4F8C"/>
+                <w:sz w:val="16"/>
+                <w:szCs w:val="16"/>
+              </w:rPr>
+              <w:t xml:space="preserve">BASE_URL</w:t>
+            </w:r>
+            <w:r>
+              <w:rPr>
+                <w:sz w:val="18"/>
+                <w:szCs w:val="18"/>
+              </w:rPr>
+              <w:t xml:space="preserve"> = the app address, e.g. </w:t>
+            </w:r>
+            <w:r>
+              <w:rPr>
+                <w:rFonts w:ascii="Consolas" w:cs="Consolas" w:eastAsia="Consolas" w:hAnsi="Consolas"/>
+                <w:color w:val="0B4F8C"/>
+                <w:sz w:val="16"/>
+                <w:szCs w:val="16"/>
+              </w:rPr>
+              <w:t xml:space="preserve">https://aral-inspection.onrender.com</w:t>
+            </w:r>
+            <w:r>
+              <w:rPr>
+                <w:sz w:val="18"/>
+                <w:szCs w:val="18"/>
+              </w:rPr>
+              <w:t xml:space="preserve"> (no </w:t>
+            </w:r>
+            <w:r>
+              <w:rPr>
+                <w:rFonts w:ascii="Consolas" w:cs="Consolas" w:eastAsia="Consolas" w:hAnsi="Consolas"/>
+                <w:color w:val="0B4F8C"/>
+                <w:sz w:val="16"/>
+                <w:szCs w:val="16"/>
+              </w:rPr>
+              <w:t xml:space="preserve">/app</w:t>
+            </w:r>
+            <w:r>
+              <w:rPr>
+                <w:sz w:val="18"/>
+                <w:szCs w:val="18"/>
+              </w:rPr>
+              <w:t xml:space="preserve">, never the GitHub address)</w:t>
+            </w:r>
+          </w:p>
+        </w:tc>
+        <w:tc>
+          <w:tcPr>
+            <w:tcW w:type="dxa" w:w="2179"/>
+            <w:tcBorders>
+              <w:top w:val="single" w:color="C9D2DE" w:sz="4"/>
+              <w:left w:val="single" w:color="C9D2DE" w:sz="4"/>
+              <w:bottom w:val="single" w:color="C9D2DE" w:sz="4"/>
+              <w:right w:val="single" w:color="C9D2DE" w:sz="4"/>
+            </w:tcBorders>
+            <w:tcMar>
+              <w:top w:type="dxa" w:w="50"/>
+              <w:left w:type="dxa" w:w="90"/>
+              <w:bottom w:type="dxa" w:w="50"/>
+              <w:right w:type="dxa" w:w="90"/>
+            </w:tcMar>
+            <w:vAlign w:val="top"/>
+          </w:tcPr>
+          <w:p>
+            <w:pPr>
+              <w:keepNext w:val="false"/>
+              <w:spacing w:after="20" w:line="260"/>
+            </w:pPr>
+            <w:r>
+              <w:rPr>
+                <w:sz w:val="18"/>
+                <w:szCs w:val="18"/>
+              </w:rPr>
+              <w:t xml:space="preserve">Render → Environment</w:t>
+            </w:r>
+          </w:p>
+        </w:tc>
+        <w:tc>
+          <w:tcPr>
+            <w:tcW w:type="dxa" w:w="3567"/>
+            <w:tcBorders>
+              <w:top w:val="single" w:color="C9D2DE" w:sz="4"/>
+              <w:left w:val="single" w:color="C9D2DE" w:sz="4"/>
+              <w:bottom w:val="single" w:color="C9D2DE" w:sz="4"/>
+              <w:right w:val="single" w:color="C9D2DE" w:sz="4"/>
+            </w:tcBorders>
+            <w:tcMar>
+              <w:top w:type="dxa" w:w="50"/>
+              <w:left w:type="dxa" w:w="90"/>
+              <w:bottom w:type="dxa" w:w="50"/>
+              <w:right w:type="dxa" w:w="90"/>
+            </w:tcMar>
+            <w:vAlign w:val="top"/>
+          </w:tcPr>
+          <w:p>
+            <w:pPr>
+              <w:keepNext w:val="false"/>
+              <w:spacing w:after="20" w:line="260"/>
+            </w:pPr>
+            <w:r>
+              <w:rPr>
+                <w:sz w:val="18"/>
+                <w:szCs w:val="18"/>
+              </w:rPr>
+              <w:t xml:space="preserve">Every client link (quotation, signing, payment, report) uses it. A wrong value opens "page not found"; the dashboard warns in red.</w:t>
+            </w:r>
+          </w:p>
+        </w:tc>
+      </w:tr>
+      <w:tr>
+        <w:trPr>
+          <w:cantSplit/>
+        </w:trPr>
+        <w:tc>
+          <w:tcPr>
+            <w:tcW w:type="dxa" w:w="396"/>
+            <w:tcBorders>
+              <w:top w:val="single" w:color="C9D2DE" w:sz="4"/>
+              <w:left w:val="single" w:color="C9D2DE" w:sz="4"/>
+              <w:bottom w:val="single" w:color="C9D2DE" w:sz="4"/>
+              <w:right w:val="single" w:color="C9D2DE" w:sz="4"/>
+            </w:tcBorders>
+            <w:shd w:fill="F7F9FC" w:color="auto" w:val="clear"/>
+            <w:tcMar>
+              <w:top w:type="dxa" w:w="50"/>
+              <w:left w:type="dxa" w:w="90"/>
+              <w:bottom w:type="dxa" w:w="50"/>
+              <w:right w:type="dxa" w:w="90"/>
+            </w:tcMar>
+            <w:vAlign w:val="top"/>
+          </w:tcPr>
+          <w:p>
+            <w:pPr>
+              <w:keepNext w:val="false"/>
+              <w:spacing w:after="20" w:line="260"/>
+            </w:pPr>
+            <w:r>
+              <w:rPr>
+                <w:sz w:val="18"/>
+                <w:szCs w:val="18"/>
+              </w:rPr>
+              <w:t xml:space="preserve">2</w:t>
+            </w:r>
+          </w:p>
+        </w:tc>
+        <w:tc>
+          <w:tcPr>
+            <w:tcW w:type="dxa" w:w="3764"/>
+            <w:tcBorders>
+              <w:top w:val="single" w:color="C9D2DE" w:sz="4"/>
+              <w:left w:val="single" w:color="C9D2DE" w:sz="4"/>
+              <w:bottom w:val="single" w:color="C9D2DE" w:sz="4"/>
+              <w:right w:val="single" w:color="C9D2DE" w:sz="4"/>
+            </w:tcBorders>
+            <w:shd w:fill="F7F9FC" w:color="auto" w:val="clear"/>
+            <w:tcMar>
+              <w:top w:type="dxa" w:w="50"/>
+              <w:left w:type="dxa" w:w="90"/>
+              <w:bottom w:type="dxa" w:w="50"/>
+              <w:right w:type="dxa" w:w="90"/>
+            </w:tcMar>
+            <w:vAlign w:val="top"/>
+          </w:tcPr>
+          <w:p>
+            <w:pPr>
+              <w:keepNext w:val="false"/>
+              <w:spacing w:after="20" w:line="260"/>
+            </w:pPr>
+            <w:r>
+              <w:rPr>
+                <w:sz w:val="18"/>
+                <w:szCs w:val="18"/>
+              </w:rPr>
+              <w:t xml:space="preserve">Gmail app password in </w:t>
+            </w:r>
+            <w:r>
+              <w:rPr>
+                <w:rFonts w:ascii="Consolas" w:cs="Consolas" w:eastAsia="Consolas" w:hAnsi="Consolas"/>
+                <w:color w:val="0B4F8C"/>
+                <w:sz w:val="16"/>
+                <w:szCs w:val="16"/>
+              </w:rPr>
+              <w:t xml:space="preserve">SMTP_PASS</w:t>
+            </w:r>
+          </w:p>
+        </w:tc>
+        <w:tc>
+          <w:tcPr>
+            <w:tcW w:type="dxa" w:w="2179"/>
+            <w:tcBorders>
+              <w:top w:val="single" w:color="C9D2DE" w:sz="4"/>
+              <w:left w:val="single" w:color="C9D2DE" w:sz="4"/>
+              <w:bottom w:val="single" w:color="C9D2DE" w:sz="4"/>
+              <w:right w:val="single" w:color="C9D2DE" w:sz="4"/>
+            </w:tcBorders>
+            <w:shd w:fill="F7F9FC" w:color="auto" w:val="clear"/>
+            <w:tcMar>
+              <w:top w:type="dxa" w:w="50"/>
+              <w:left w:type="dxa" w:w="90"/>
+              <w:bottom w:type="dxa" w:w="50"/>
+              <w:right w:type="dxa" w:w="90"/>
+            </w:tcMar>
+            <w:vAlign w:val="top"/>
+          </w:tcPr>
+          <w:p>
+            <w:pPr>
+              <w:keepNext w:val="false"/>
+              <w:spacing w:after="20" w:line="260"/>
+            </w:pPr>
+            <w:r>
+              <w:rPr>
+                <w:sz w:val="18"/>
+                <w:szCs w:val="18"/>
+              </w:rPr>
+              <w:t xml:space="preserve">Render → Environment</w:t>
+            </w:r>
+          </w:p>
+        </w:tc>
+        <w:tc>
+          <w:tcPr>
+            <w:tcW w:type="dxa" w:w="3567"/>
+            <w:tcBorders>
+              <w:top w:val="single" w:color="C9D2DE" w:sz="4"/>
+              <w:left w:val="single" w:color="C9D2DE" w:sz="4"/>
+              <w:bottom w:val="single" w:color="C9D2DE" w:sz="4"/>
+              <w:right w:val="single" w:color="C9D2DE" w:sz="4"/>
+            </w:tcBorders>
+            <w:shd w:fill="F7F9FC" w:color="auto" w:val="clear"/>
+            <w:tcMar>
+              <w:top w:type="dxa" w:w="50"/>
+              <w:left w:type="dxa" w:w="90"/>
+              <w:bottom w:type="dxa" w:w="50"/>
+              <w:right w:type="dxa" w:w="90"/>
+            </w:tcMar>
+            <w:vAlign w:val="top"/>
+          </w:tcPr>
+          <w:p>
+            <w:pPr>
+              <w:keepNext w:val="false"/>
+              <w:spacing w:after="20" w:line="260"/>
+            </w:pPr>
+            <w:r>
+              <w:rPr>
+                <w:sz w:val="18"/>
+                <w:szCs w:val="18"/>
+              </w:rPr>
+              <w:t xml:space="preserve">Without it emails are only logged under Settings → Messages and clients receive nothing.</w:t>
+            </w:r>
+          </w:p>
+        </w:tc>
+      </w:tr>
+      <w:tr>
+        <w:trPr>
+          <w:cantSplit/>
+        </w:trPr>
+        <w:tc>
+          <w:tcPr>
+            <w:tcW w:type="dxa" w:w="396"/>
+            <w:tcBorders>
+              <w:top w:val="single" w:color="C9D2DE" w:sz="4"/>
+              <w:left w:val="single" w:color="C9D2DE" w:sz="4"/>
+              <w:bottom w:val="single" w:color="C9D2DE" w:sz="4"/>
+              <w:right w:val="single" w:color="C9D2DE" w:sz="4"/>
+            </w:tcBorders>
+            <w:tcMar>
+              <w:top w:type="dxa" w:w="50"/>
+              <w:left w:type="dxa" w:w="90"/>
+              <w:bottom w:type="dxa" w:w="50"/>
+              <w:right w:type="dxa" w:w="90"/>
+            </w:tcMar>
+            <w:vAlign w:val="top"/>
+          </w:tcPr>
+          <w:p>
+            <w:pPr>
+              <w:keepNext w:val="false"/>
+              <w:spacing w:after="20" w:line="260"/>
+            </w:pPr>
+            <w:r>
+              <w:rPr>
+                <w:sz w:val="18"/>
+                <w:szCs w:val="18"/>
+              </w:rPr>
+              <w:t xml:space="preserve">3</w:t>
+            </w:r>
+          </w:p>
+        </w:tc>
+        <w:tc>
+          <w:tcPr>
+            <w:tcW w:type="dxa" w:w="3764"/>
+            <w:tcBorders>
+              <w:top w:val="single" w:color="C9D2DE" w:sz="4"/>
+              <w:left w:val="single" w:color="C9D2DE" w:sz="4"/>
+              <w:bottom w:val="single" w:color="C9D2DE" w:sz="4"/>
+              <w:right w:val="single" w:color="C9D2DE" w:sz="4"/>
+            </w:tcBorders>
+            <w:tcMar>
+              <w:top w:type="dxa" w:w="50"/>
+              <w:left w:type="dxa" w:w="90"/>
+              <w:bottom w:type="dxa" w:w="50"/>
+              <w:right w:type="dxa" w:w="90"/>
+            </w:tcMar>
+            <w:vAlign w:val="top"/>
+          </w:tcPr>
+          <w:p>
+            <w:pPr>
+              <w:keepNext w:val="false"/>
+              <w:spacing w:after="20" w:line="260"/>
+            </w:pPr>
+            <w:r>
+              <w:rPr>
+                <w:sz w:val="18"/>
+                <w:szCs w:val="18"/>
+              </w:rPr>
+              <w:t xml:space="preserve">Company details: DET licence, RERA no., phone, email, website, bank details, branch address</w:t>
+            </w:r>
+          </w:p>
+        </w:tc>
+        <w:tc>
+          <w:tcPr>
+            <w:tcW w:type="dxa" w:w="2179"/>
+            <w:tcBorders>
+              <w:top w:val="single" w:color="C9D2DE" w:sz="4"/>
+              <w:left w:val="single" w:color="C9D2DE" w:sz="4"/>
+              <w:bottom w:val="single" w:color="C9D2DE" w:sz="4"/>
+              <w:right w:val="single" w:color="C9D2DE" w:sz="4"/>
+            </w:tcBorders>
+            <w:tcMar>
+              <w:top w:type="dxa" w:w="50"/>
+              <w:left w:type="dxa" w:w="90"/>
+              <w:bottom w:type="dxa" w:w="50"/>
+              <w:right w:type="dxa" w:w="90"/>
+            </w:tcMar>
+            <w:vAlign w:val="top"/>
+          </w:tcPr>
+          <w:p>
+            <w:pPr>
+              <w:keepNext w:val="false"/>
+              <w:spacing w:after="20" w:line="260"/>
+            </w:pPr>
+            <w:r>
+              <w:rPr>
+                <w:sz w:val="18"/>
+                <w:szCs w:val="18"/>
+              </w:rPr>
+              <w:t xml:space="preserve">Settings → Company details</w:t>
+            </w:r>
+          </w:p>
+        </w:tc>
+        <w:tc>
+          <w:tcPr>
+            <w:tcW w:type="dxa" w:w="3567"/>
+            <w:tcBorders>
+              <w:top w:val="single" w:color="C9D2DE" w:sz="4"/>
+              <w:left w:val="single" w:color="C9D2DE" w:sz="4"/>
+              <w:bottom w:val="single" w:color="C9D2DE" w:sz="4"/>
+              <w:right w:val="single" w:color="C9D2DE" w:sz="4"/>
+            </w:tcBorders>
+            <w:tcMar>
+              <w:top w:type="dxa" w:w="50"/>
+              <w:left w:type="dxa" w:w="90"/>
+              <w:bottom w:type="dxa" w:w="50"/>
+              <w:right w:type="dxa" w:w="90"/>
+            </w:tcMar>
+            <w:vAlign w:val="top"/>
+          </w:tcPr>
+          <w:p>
+            <w:pPr>
+              <w:keepNext w:val="false"/>
+              <w:spacing w:after="20" w:line="260"/>
+            </w:pPr>
+            <w:r>
+              <w:rPr>
+                <w:sz w:val="18"/>
+                <w:szCs w:val="18"/>
+              </w:rPr>
+              <w:t xml:space="preserve">Printed on every quotation, invoice and report.</w:t>
+            </w:r>
+          </w:p>
+        </w:tc>
+      </w:tr>
+      <w:tr>
+        <w:trPr>
+          <w:cantSplit/>
+        </w:trPr>
+        <w:tc>
+          <w:tcPr>
+            <w:tcW w:type="dxa" w:w="396"/>
+            <w:tcBorders>
+              <w:top w:val="single" w:color="C9D2DE" w:sz="4"/>
+              <w:left w:val="single" w:color="C9D2DE" w:sz="4"/>
+              <w:bottom w:val="single" w:color="C9D2DE" w:sz="4"/>
+              <w:right w:val="single" w:color="C9D2DE" w:sz="4"/>
+            </w:tcBorders>
+            <w:shd w:fill="F7F9FC" w:color="auto" w:val="clear"/>
+            <w:tcMar>
+              <w:top w:type="dxa" w:w="50"/>
+              <w:left w:type="dxa" w:w="90"/>
+              <w:bottom w:type="dxa" w:w="50"/>
+              <w:right w:type="dxa" w:w="90"/>
+            </w:tcMar>
+            <w:vAlign w:val="top"/>
+          </w:tcPr>
+          <w:p>
+            <w:pPr>
+              <w:keepNext w:val="false"/>
+              <w:spacing w:after="20" w:line="260"/>
+            </w:pPr>
+            <w:r>
+              <w:rPr>
+                <w:sz w:val="18"/>
+                <w:szCs w:val="18"/>
+              </w:rPr>
+              <w:t xml:space="preserve">4</w:t>
+            </w:r>
+          </w:p>
+        </w:tc>
+        <w:tc>
+          <w:tcPr>
+            <w:tcW w:type="dxa" w:w="3764"/>
+            <w:tcBorders>
+              <w:top w:val="single" w:color="C9D2DE" w:sz="4"/>
+              <w:left w:val="single" w:color="C9D2DE" w:sz="4"/>
+              <w:bottom w:val="single" w:color="C9D2DE" w:sz="4"/>
+              <w:right w:val="single" w:color="C9D2DE" w:sz="4"/>
+            </w:tcBorders>
+            <w:shd w:fill="F7F9FC" w:color="auto" w:val="clear"/>
+            <w:tcMar>
+              <w:top w:type="dxa" w:w="50"/>
+              <w:left w:type="dxa" w:w="90"/>
+              <w:bottom w:type="dxa" w:w="50"/>
+              <w:right w:type="dxa" w:w="90"/>
+            </w:tcMar>
+            <w:vAlign w:val="top"/>
+          </w:tcPr>
+          <w:p>
+            <w:pPr>
+              <w:keepNext w:val="false"/>
+              <w:spacing w:after="20" w:line="260"/>
+            </w:pPr>
+            <w:r>
+              <w:rPr>
+                <w:sz w:val="18"/>
+                <w:szCs w:val="18"/>
+              </w:rPr>
+              <w:t xml:space="preserve">Inspectors with licence, insurance and agreement dates</w:t>
+            </w:r>
+          </w:p>
+        </w:tc>
+        <w:tc>
+          <w:tcPr>
+            <w:tcW w:type="dxa" w:w="2179"/>
+            <w:tcBorders>
+              <w:top w:val="single" w:color="C9D2DE" w:sz="4"/>
+              <w:left w:val="single" w:color="C9D2DE" w:sz="4"/>
+              <w:bottom w:val="single" w:color="C9D2DE" w:sz="4"/>
+              <w:right w:val="single" w:color="C9D2DE" w:sz="4"/>
+            </w:tcBorders>
+            <w:shd w:fill="F7F9FC" w:color="auto" w:val="clear"/>
+            <w:tcMar>
+              <w:top w:type="dxa" w:w="50"/>
+              <w:left w:type="dxa" w:w="90"/>
+              <w:bottom w:type="dxa" w:w="50"/>
+              <w:right w:type="dxa" w:w="90"/>
+            </w:tcMar>
+            <w:vAlign w:val="top"/>
+          </w:tcPr>
+          <w:p>
+            <w:pPr>
+              <w:keepNext w:val="false"/>
+              <w:spacing w:after="20" w:line="260"/>
+            </w:pPr>
+            <w:r>
+              <w:rPr>
+                <w:sz w:val="18"/>
+                <w:szCs w:val="18"/>
+              </w:rPr>
+              <w:t xml:space="preserve">Settings → Inspectors</w:t>
+            </w:r>
+          </w:p>
+        </w:tc>
+        <w:tc>
+          <w:tcPr>
+            <w:tcW w:type="dxa" w:w="3567"/>
+            <w:tcBorders>
+              <w:top w:val="single" w:color="C9D2DE" w:sz="4"/>
+              <w:left w:val="single" w:color="C9D2DE" w:sz="4"/>
+              <w:bottom w:val="single" w:color="C9D2DE" w:sz="4"/>
+              <w:right w:val="single" w:color="C9D2DE" w:sz="4"/>
+            </w:tcBorders>
+            <w:shd w:fill="F7F9FC" w:color="auto" w:val="clear"/>
+            <w:tcMar>
+              <w:top w:type="dxa" w:w="50"/>
+              <w:left w:type="dxa" w:w="90"/>
+              <w:bottom w:type="dxa" w:w="50"/>
+              <w:right w:type="dxa" w:w="90"/>
+            </w:tcMar>
+            <w:vAlign w:val="top"/>
+          </w:tcPr>
+          <w:p>
+            <w:pPr>
+              <w:keepNext w:val="false"/>
+              <w:spacing w:after="20" w:line="260"/>
+            </w:pPr>
+            <w:r>
+              <w:rPr>
+                <w:sz w:val="18"/>
+                <w:szCs w:val="18"/>
+              </w:rPr>
+              <w:t xml:space="preserve">Scheduling blocks inspectors with expired documents.</w:t>
+            </w:r>
+          </w:p>
+        </w:tc>
+      </w:tr>
+      <w:tr>
+        <w:trPr>
+          <w:cantSplit/>
+        </w:trPr>
+        <w:tc>
+          <w:tcPr>
+            <w:tcW w:type="dxa" w:w="396"/>
+            <w:tcBorders>
+              <w:top w:val="single" w:color="C9D2DE" w:sz="4"/>
+              <w:left w:val="single" w:color="C9D2DE" w:sz="4"/>
+              <w:bottom w:val="single" w:color="C9D2DE" w:sz="4"/>
+              <w:right w:val="single" w:color="C9D2DE" w:sz="4"/>
+            </w:tcBorders>
+            <w:tcMar>
+              <w:top w:type="dxa" w:w="50"/>
+              <w:left w:type="dxa" w:w="90"/>
+              <w:bottom w:type="dxa" w:w="50"/>
+              <w:right w:type="dxa" w:w="90"/>
+            </w:tcMar>
+            <w:vAlign w:val="top"/>
+          </w:tcPr>
+          <w:p>
+            <w:pPr>
+              <w:keepNext w:val="false"/>
+              <w:spacing w:after="20" w:line="260"/>
+            </w:pPr>
+            <w:r>
+              <w:rPr>
+                <w:sz w:val="18"/>
+                <w:szCs w:val="18"/>
+              </w:rPr>
+              <w:t xml:space="preserve">5</w:t>
+            </w:r>
+          </w:p>
+        </w:tc>
+        <w:tc>
+          <w:tcPr>
+            <w:tcW w:type="dxa" w:w="3764"/>
+            <w:tcBorders>
+              <w:top w:val="single" w:color="C9D2DE" w:sz="4"/>
+              <w:left w:val="single" w:color="C9D2DE" w:sz="4"/>
+              <w:bottom w:val="single" w:color="C9D2DE" w:sz="4"/>
+              <w:right w:val="single" w:color="C9D2DE" w:sz="4"/>
+            </w:tcBorders>
+            <w:tcMar>
+              <w:top w:type="dxa" w:w="50"/>
+              <w:left w:type="dxa" w:w="90"/>
+              <w:bottom w:type="dxa" w:w="50"/>
+              <w:right w:type="dxa" w:w="90"/>
+            </w:tcMar>
+            <w:vAlign w:val="top"/>
+          </w:tcPr>
+          <w:p>
+            <w:pPr>
+              <w:keepNext w:val="false"/>
+              <w:spacing w:after="20" w:line="260"/>
+            </w:pPr>
+            <w:r>
+              <w:rPr>
+                <w:sz w:val="18"/>
+                <w:szCs w:val="18"/>
+              </w:rPr>
+              <w:t xml:space="preserve">A login for each inspector, linked to their inspector record</w:t>
+            </w:r>
+          </w:p>
+        </w:tc>
+        <w:tc>
+          <w:tcPr>
+            <w:tcW w:type="dxa" w:w="2179"/>
+            <w:tcBorders>
+              <w:top w:val="single" w:color="C9D2DE" w:sz="4"/>
+              <w:left w:val="single" w:color="C9D2DE" w:sz="4"/>
+              <w:bottom w:val="single" w:color="C9D2DE" w:sz="4"/>
+              <w:right w:val="single" w:color="C9D2DE" w:sz="4"/>
+            </w:tcBorders>
+            <w:tcMar>
+              <w:top w:type="dxa" w:w="50"/>
+              <w:left w:type="dxa" w:w="90"/>
+              <w:bottom w:type="dxa" w:w="50"/>
+              <w:right w:type="dxa" w:w="90"/>
+            </w:tcMar>
+            <w:vAlign w:val="top"/>
+          </w:tcPr>
+          <w:p>
+            <w:pPr>
+              <w:keepNext w:val="false"/>
+              <w:spacing w:after="20" w:line="260"/>
+            </w:pPr>
+            <w:r>
+              <w:rPr>
+                <w:sz w:val="18"/>
+                <w:szCs w:val="18"/>
+              </w:rPr>
+              <w:t xml:space="preserve">Settings → Users (role Inspector, "Inspector record")</w:t>
+            </w:r>
+          </w:p>
+        </w:tc>
+        <w:tc>
+          <w:tcPr>
+            <w:tcW w:type="dxa" w:w="3567"/>
+            <w:tcBorders>
+              <w:top w:val="single" w:color="C9D2DE" w:sz="4"/>
+              <w:left w:val="single" w:color="C9D2DE" w:sz="4"/>
+              <w:bottom w:val="single" w:color="C9D2DE" w:sz="4"/>
+              <w:right w:val="single" w:color="C9D2DE" w:sz="4"/>
+            </w:tcBorders>
+            <w:tcMar>
+              <w:top w:type="dxa" w:w="50"/>
+              <w:left w:type="dxa" w:w="90"/>
+              <w:bottom w:type="dxa" w:w="50"/>
+              <w:right w:type="dxa" w:w="90"/>
+            </w:tcMar>
+            <w:vAlign w:val="top"/>
+          </w:tcPr>
+          <w:p>
+            <w:pPr>
+              <w:keepNext w:val="false"/>
+              <w:spacing w:after="20" w:line="260"/>
+            </w:pPr>
+            <w:r>
+              <w:rPr>
+                <w:sz w:val="18"/>
+                <w:szCs w:val="18"/>
+              </w:rPr>
+              <w:t xml:space="preserve">Without the link the inspector sees no jobs on the phone.</w:t>
+            </w:r>
+          </w:p>
+        </w:tc>
+      </w:tr>
+      <w:tr>
+        <w:trPr>
+          <w:cantSplit/>
+        </w:trPr>
+        <w:tc>
+          <w:tcPr>
+            <w:tcW w:type="dxa" w:w="396"/>
+            <w:tcBorders>
+              <w:top w:val="single" w:color="C9D2DE" w:sz="4"/>
+              <w:left w:val="single" w:color="C9D2DE" w:sz="4"/>
+              <w:bottom w:val="single" w:color="C9D2DE" w:sz="4"/>
+              <w:right w:val="single" w:color="C9D2DE" w:sz="4"/>
+            </w:tcBorders>
+            <w:shd w:fill="F7F9FC" w:color="auto" w:val="clear"/>
+            <w:tcMar>
+              <w:top w:type="dxa" w:w="50"/>
+              <w:left w:type="dxa" w:w="90"/>
+              <w:bottom w:type="dxa" w:w="50"/>
+              <w:right w:type="dxa" w:w="90"/>
+            </w:tcMar>
+            <w:vAlign w:val="top"/>
+          </w:tcPr>
+          <w:p>
+            <w:pPr>
+              <w:keepNext w:val="false"/>
+              <w:spacing w:after="20" w:line="260"/>
+            </w:pPr>
+            <w:r>
+              <w:rPr>
+                <w:sz w:val="18"/>
+                <w:szCs w:val="18"/>
+              </w:rPr>
+              <w:t xml:space="preserve">6</w:t>
+            </w:r>
+          </w:p>
+        </w:tc>
+        <w:tc>
+          <w:tcPr>
+            <w:tcW w:type="dxa" w:w="3764"/>
+            <w:tcBorders>
+              <w:top w:val="single" w:color="C9D2DE" w:sz="4"/>
+              <w:left w:val="single" w:color="C9D2DE" w:sz="4"/>
+              <w:bottom w:val="single" w:color="C9D2DE" w:sz="4"/>
+              <w:right w:val="single" w:color="C9D2DE" w:sz="4"/>
+            </w:tcBorders>
+            <w:shd w:fill="F7F9FC" w:color="auto" w:val="clear"/>
+            <w:tcMar>
+              <w:top w:type="dxa" w:w="50"/>
+              <w:left w:type="dxa" w:w="90"/>
+              <w:bottom w:type="dxa" w:w="50"/>
+              <w:right w:type="dxa" w:w="90"/>
+            </w:tcMar>
+            <w:vAlign w:val="top"/>
+          </w:tcPr>
+          <w:p>
+            <w:pPr>
+              <w:keepNext w:val="false"/>
+              <w:spacing w:after="20" w:line="260"/>
+            </w:pPr>
+            <w:r>
+              <w:rPr>
+                <w:sz w:val="18"/>
+                <w:szCs w:val="18"/>
+              </w:rPr>
+              <w:t xml:space="preserve">Equipment with calibration dates (thermal cameras)</w:t>
+            </w:r>
+          </w:p>
+        </w:tc>
+        <w:tc>
+          <w:tcPr>
+            <w:tcW w:type="dxa" w:w="2179"/>
+            <w:tcBorders>
+              <w:top w:val="single" w:color="C9D2DE" w:sz="4"/>
+              <w:left w:val="single" w:color="C9D2DE" w:sz="4"/>
+              <w:bottom w:val="single" w:color="C9D2DE" w:sz="4"/>
+              <w:right w:val="single" w:color="C9D2DE" w:sz="4"/>
+            </w:tcBorders>
+            <w:shd w:fill="F7F9FC" w:color="auto" w:val="clear"/>
+            <w:tcMar>
+              <w:top w:type="dxa" w:w="50"/>
+              <w:left w:type="dxa" w:w="90"/>
+              <w:bottom w:type="dxa" w:w="50"/>
+              <w:right w:type="dxa" w:w="90"/>
+            </w:tcMar>
+            <w:vAlign w:val="top"/>
+          </w:tcPr>
+          <w:p>
+            <w:pPr>
+              <w:keepNext w:val="false"/>
+              <w:spacing w:after="20" w:line="260"/>
+            </w:pPr>
+            <w:r>
+              <w:rPr>
+                <w:sz w:val="18"/>
+                <w:szCs w:val="18"/>
+              </w:rPr>
+              <w:t xml:space="preserve">Settings → Equipment</w:t>
+            </w:r>
+          </w:p>
+        </w:tc>
+        <w:tc>
+          <w:tcPr>
+            <w:tcW w:type="dxa" w:w="3567"/>
+            <w:tcBorders>
+              <w:top w:val="single" w:color="C9D2DE" w:sz="4"/>
+              <w:left w:val="single" w:color="C9D2DE" w:sz="4"/>
+              <w:bottom w:val="single" w:color="C9D2DE" w:sz="4"/>
+              <w:right w:val="single" w:color="C9D2DE" w:sz="4"/>
+            </w:tcBorders>
+            <w:shd w:fill="F7F9FC" w:color="auto" w:val="clear"/>
+            <w:tcMar>
+              <w:top w:type="dxa" w:w="50"/>
+              <w:left w:type="dxa" w:w="90"/>
+              <w:bottom w:type="dxa" w:w="50"/>
+              <w:right w:type="dxa" w:w="90"/>
+            </w:tcMar>
+            <w:vAlign w:val="top"/>
+          </w:tcPr>
+          <w:p>
+            <w:pPr>
+              <w:keepNext w:val="false"/>
+              <w:spacing w:after="20" w:line="260"/>
+            </w:pPr>
+            <w:r>
+              <w:rPr>
+                <w:sz w:val="18"/>
+                <w:szCs w:val="18"/>
+              </w:rPr>
+              <w:t xml:space="preserve">Thermal jobs need a free camera within calibration.</w:t>
+            </w:r>
+          </w:p>
+        </w:tc>
+      </w:tr>
+      <w:tr>
+        <w:trPr>
+          <w:cantSplit/>
+        </w:trPr>
+        <w:tc>
+          <w:tcPr>
+            <w:tcW w:type="dxa" w:w="396"/>
+            <w:tcBorders>
+              <w:top w:val="single" w:color="C9D2DE" w:sz="4"/>
+              <w:left w:val="single" w:color="C9D2DE" w:sz="4"/>
+              <w:bottom w:val="single" w:color="C9D2DE" w:sz="4"/>
+              <w:right w:val="single" w:color="C9D2DE" w:sz="4"/>
+            </w:tcBorders>
+            <w:tcMar>
+              <w:top w:type="dxa" w:w="50"/>
+              <w:left w:type="dxa" w:w="90"/>
+              <w:bottom w:type="dxa" w:w="50"/>
+              <w:right w:type="dxa" w:w="90"/>
+            </w:tcMar>
+            <w:vAlign w:val="top"/>
+          </w:tcPr>
+          <w:p>
+            <w:pPr>
+              <w:keepNext w:val="false"/>
+              <w:spacing w:after="20" w:line="260"/>
+            </w:pPr>
+            <w:r>
+              <w:rPr>
+                <w:sz w:val="18"/>
+                <w:szCs w:val="18"/>
+              </w:rPr>
+              <w:t xml:space="preserve">7</w:t>
+            </w:r>
+          </w:p>
+        </w:tc>
+        <w:tc>
+          <w:tcPr>
+            <w:tcW w:type="dxa" w:w="3764"/>
+            <w:tcBorders>
+              <w:top w:val="single" w:color="C9D2DE" w:sz="4"/>
+              <w:left w:val="single" w:color="C9D2DE" w:sz="4"/>
+              <w:bottom w:val="single" w:color="C9D2DE" w:sz="4"/>
+              <w:right w:val="single" w:color="C9D2DE" w:sz="4"/>
+            </w:tcBorders>
+            <w:tcMar>
+              <w:top w:type="dxa" w:w="50"/>
+              <w:left w:type="dxa" w:w="90"/>
+              <w:bottom w:type="dxa" w:w="50"/>
+              <w:right w:type="dxa" w:w="90"/>
+            </w:tcMar>
+            <w:vAlign w:val="top"/>
+          </w:tcPr>
+          <w:p>
+            <w:pPr>
+              <w:keepNext w:val="false"/>
+              <w:spacing w:after="20" w:line="260"/>
+            </w:pPr>
+            <w:r>
+              <w:rPr>
+                <w:sz w:val="18"/>
+                <w:szCs w:val="18"/>
+              </w:rPr>
+              <w:t xml:space="preserve">Lawyer-approved service agreement, terms and thermal addendum</w:t>
+            </w:r>
+          </w:p>
+        </w:tc>
+        <w:tc>
+          <w:tcPr>
+            <w:tcW w:type="dxa" w:w="2179"/>
+            <w:tcBorders>
+              <w:top w:val="single" w:color="C9D2DE" w:sz="4"/>
+              <w:left w:val="single" w:color="C9D2DE" w:sz="4"/>
+              <w:bottom w:val="single" w:color="C9D2DE" w:sz="4"/>
+              <w:right w:val="single" w:color="C9D2DE" w:sz="4"/>
+            </w:tcBorders>
+            <w:tcMar>
+              <w:top w:type="dxa" w:w="50"/>
+              <w:left w:type="dxa" w:w="90"/>
+              <w:bottom w:type="dxa" w:w="50"/>
+              <w:right w:type="dxa" w:w="90"/>
+            </w:tcMar>
+            <w:vAlign w:val="top"/>
+          </w:tcPr>
+          <w:p>
+            <w:pPr>
+              <w:keepNext w:val="false"/>
+              <w:spacing w:after="20" w:line="260"/>
+            </w:pPr>
+            <w:r>
+              <w:rPr>
+                <w:sz w:val="18"/>
+                <w:szCs w:val="18"/>
+              </w:rPr>
+              <w:t xml:space="preserve">Settings → Report &amp; terms wording</w:t>
+            </w:r>
+          </w:p>
+        </w:tc>
+        <w:tc>
+          <w:tcPr>
+            <w:tcW w:type="dxa" w:w="3567"/>
+            <w:tcBorders>
+              <w:top w:val="single" w:color="C9D2DE" w:sz="4"/>
+              <w:left w:val="single" w:color="C9D2DE" w:sz="4"/>
+              <w:bottom w:val="single" w:color="C9D2DE" w:sz="4"/>
+              <w:right w:val="single" w:color="C9D2DE" w:sz="4"/>
+            </w:tcBorders>
+            <w:tcMar>
+              <w:top w:type="dxa" w:w="50"/>
+              <w:left w:type="dxa" w:w="90"/>
+              <w:bottom w:type="dxa" w:w="50"/>
+              <w:right w:type="dxa" w:w="90"/>
+            </w:tcMar>
+            <w:vAlign w:val="top"/>
+          </w:tcPr>
+          <w:p>
+            <w:pPr>
+              <w:keepNext w:val="false"/>
+              <w:spacing w:after="20" w:line="260"/>
+            </w:pPr>
+            <w:r>
+              <w:rPr>
+                <w:sz w:val="18"/>
+                <w:szCs w:val="18"/>
+              </w:rPr>
+              <w:t xml:space="preserve">The current texts are drafts.</w:t>
+            </w:r>
+          </w:p>
+        </w:tc>
+      </w:tr>
+      <w:tr>
+        <w:trPr>
+          <w:cantSplit/>
+        </w:trPr>
+        <w:tc>
+          <w:tcPr>
+            <w:tcW w:type="dxa" w:w="396"/>
+            <w:tcBorders>
+              <w:top w:val="single" w:color="C9D2DE" w:sz="4"/>
+              <w:left w:val="single" w:color="C9D2DE" w:sz="4"/>
+              <w:bottom w:val="single" w:color="C9D2DE" w:sz="4"/>
+              <w:right w:val="single" w:color="C9D2DE" w:sz="4"/>
+            </w:tcBorders>
+            <w:shd w:fill="F7F9FC" w:color="auto" w:val="clear"/>
+            <w:tcMar>
+              <w:top w:type="dxa" w:w="50"/>
+              <w:left w:type="dxa" w:w="90"/>
+              <w:bottom w:type="dxa" w:w="50"/>
+              <w:right w:type="dxa" w:w="90"/>
+            </w:tcMar>
+            <w:vAlign w:val="top"/>
+          </w:tcPr>
+          <w:p>
+            <w:pPr>
+              <w:keepNext w:val="false"/>
+              <w:spacing w:after="20" w:line="260"/>
+            </w:pPr>
+            <w:r>
+              <w:rPr>
+                <w:sz w:val="18"/>
+                <w:szCs w:val="18"/>
+              </w:rPr>
+              <w:t xml:space="preserve">8</w:t>
+            </w:r>
+          </w:p>
+        </w:tc>
+        <w:tc>
+          <w:tcPr>
+            <w:tcW w:type="dxa" w:w="3764"/>
+            <w:tcBorders>
+              <w:top w:val="single" w:color="C9D2DE" w:sz="4"/>
+              <w:left w:val="single" w:color="C9D2DE" w:sz="4"/>
+              <w:bottom w:val="single" w:color="C9D2DE" w:sz="4"/>
+              <w:right w:val="single" w:color="C9D2DE" w:sz="4"/>
+            </w:tcBorders>
+            <w:shd w:fill="F7F9FC" w:color="auto" w:val="clear"/>
+            <w:tcMar>
+              <w:top w:type="dxa" w:w="50"/>
+              <w:left w:type="dxa" w:w="90"/>
+              <w:bottom w:type="dxa" w:w="50"/>
+              <w:right w:type="dxa" w:w="90"/>
+            </w:tcMar>
+            <w:vAlign w:val="top"/>
+          </w:tcPr>
+          <w:p>
+            <w:pPr>
+              <w:keepNext w:val="false"/>
+              <w:spacing w:after="20" w:line="260"/>
+            </w:pPr>
+            <w:r>
+              <w:rPr>
+                <w:sz w:val="18"/>
+                <w:szCs w:val="18"/>
+              </w:rPr>
+              <w:t xml:space="preserve">Google Drive keys (</w:t>
+            </w:r>
+            <w:r>
+              <w:rPr>
+                <w:rFonts w:ascii="Consolas" w:cs="Consolas" w:eastAsia="Consolas" w:hAnsi="Consolas"/>
+                <w:color w:val="0B4F8C"/>
+                <w:sz w:val="16"/>
+                <w:szCs w:val="16"/>
+              </w:rPr>
+              <w:t xml:space="preserve">GOOGLE_CLIENT_ID</w:t>
+            </w:r>
+            <w:r>
+              <w:rPr>
+                <w:sz w:val="18"/>
+                <w:szCs w:val="18"/>
+              </w:rPr>
+              <w:t xml:space="preserve">, </w:t>
+            </w:r>
+            <w:r>
+              <w:rPr>
+                <w:rFonts w:ascii="Consolas" w:cs="Consolas" w:eastAsia="Consolas" w:hAnsi="Consolas"/>
+                <w:color w:val="0B4F8C"/>
+                <w:sz w:val="16"/>
+                <w:szCs w:val="16"/>
+              </w:rPr>
+              <w:t xml:space="preserve">GOOGLE_CLIENT_SECRET</w:t>
+            </w:r>
+            <w:r>
+              <w:rPr>
+                <w:sz w:val="18"/>
+                <w:szCs w:val="18"/>
+              </w:rPr>
+              <w:t xml:space="preserve">, </w:t>
+            </w:r>
+            <w:r>
+              <w:rPr>
+                <w:rFonts w:ascii="Consolas" w:cs="Consolas" w:eastAsia="Consolas" w:hAnsi="Consolas"/>
+                <w:color w:val="0B4F8C"/>
+                <w:sz w:val="16"/>
+                <w:szCs w:val="16"/>
+              </w:rPr>
+              <w:t xml:space="preserve">GOOGLE_REFRESH_TOKEN</w:t>
+            </w:r>
+            <w:r>
+              <w:rPr>
+                <w:sz w:val="18"/>
+                <w:szCs w:val="18"/>
+              </w:rPr>
+              <w:t xml:space="preserve">)</w:t>
+            </w:r>
+          </w:p>
+        </w:tc>
+        <w:tc>
+          <w:tcPr>
+            <w:tcW w:type="dxa" w:w="2179"/>
+            <w:tcBorders>
+              <w:top w:val="single" w:color="C9D2DE" w:sz="4"/>
+              <w:left w:val="single" w:color="C9D2DE" w:sz="4"/>
+              <w:bottom w:val="single" w:color="C9D2DE" w:sz="4"/>
+              <w:right w:val="single" w:color="C9D2DE" w:sz="4"/>
+            </w:tcBorders>
+            <w:shd w:fill="F7F9FC" w:color="auto" w:val="clear"/>
+            <w:tcMar>
+              <w:top w:type="dxa" w:w="50"/>
+              <w:left w:type="dxa" w:w="90"/>
+              <w:bottom w:type="dxa" w:w="50"/>
+              <w:right w:type="dxa" w:w="90"/>
+            </w:tcMar>
+            <w:vAlign w:val="top"/>
+          </w:tcPr>
+          <w:p>
+            <w:pPr>
+              <w:keepNext w:val="false"/>
+              <w:spacing w:after="20" w:line="260"/>
+            </w:pPr>
+            <w:r>
+              <w:rPr>
+                <w:sz w:val="18"/>
+                <w:szCs w:val="18"/>
+              </w:rPr>
+              <w:t xml:space="preserve">Render → Environment</w:t>
+            </w:r>
+          </w:p>
+        </w:tc>
+        <w:tc>
+          <w:tcPr>
+            <w:tcW w:type="dxa" w:w="3567"/>
+            <w:tcBorders>
+              <w:top w:val="single" w:color="C9D2DE" w:sz="4"/>
+              <w:left w:val="single" w:color="C9D2DE" w:sz="4"/>
+              <w:bottom w:val="single" w:color="C9D2DE" w:sz="4"/>
+              <w:right w:val="single" w:color="C9D2DE" w:sz="4"/>
+            </w:tcBorders>
+            <w:shd w:fill="F7F9FC" w:color="auto" w:val="clear"/>
+            <w:tcMar>
+              <w:top w:type="dxa" w:w="50"/>
+              <w:left w:type="dxa" w:w="90"/>
+              <w:bottom w:type="dxa" w:w="50"/>
+              <w:right w:type="dxa" w:w="90"/>
+            </w:tcMar>
+            <w:vAlign w:val="top"/>
+          </w:tcPr>
+          <w:p>
+            <w:pPr>
+              <w:keepNext w:val="false"/>
+              <w:spacing w:after="20" w:line="260"/>
+            </w:pPr>
+            <w:r>
+              <w:rPr>
+                <w:sz w:val="18"/>
+                <w:szCs w:val="18"/>
+              </w:rPr>
+              <w:t xml:space="preserve">Photos and PDFs go to Drive, one folder per job; otherwise to the server disk.</w:t>
+            </w:r>
+          </w:p>
+        </w:tc>
+      </w:tr>
+      <w:tr>
+        <w:trPr>
+          <w:cantSplit/>
+        </w:trPr>
+        <w:tc>
+          <w:tcPr>
+            <w:tcW w:type="dxa" w:w="396"/>
+            <w:tcBorders>
+              <w:top w:val="single" w:color="C9D2DE" w:sz="4"/>
+              <w:left w:val="single" w:color="C9D2DE" w:sz="4"/>
+              <w:bottom w:val="single" w:color="C9D2DE" w:sz="4"/>
+              <w:right w:val="single" w:color="C9D2DE" w:sz="4"/>
+            </w:tcBorders>
+            <w:tcMar>
+              <w:top w:type="dxa" w:w="50"/>
+              <w:left w:type="dxa" w:w="90"/>
+              <w:bottom w:type="dxa" w:w="50"/>
+              <w:right w:type="dxa" w:w="90"/>
+            </w:tcMar>
+            <w:vAlign w:val="top"/>
+          </w:tcPr>
+          <w:p>
+            <w:pPr>
+              <w:keepNext w:val="false"/>
+              <w:spacing w:after="20" w:line="260"/>
+            </w:pPr>
+            <w:r>
+              <w:rPr>
+                <w:sz w:val="18"/>
+                <w:szCs w:val="18"/>
+              </w:rPr>
+              <w:t xml:space="preserve">9</w:t>
+            </w:r>
+          </w:p>
+        </w:tc>
+        <w:tc>
+          <w:tcPr>
+            <w:tcW w:type="dxa" w:w="3764"/>
+            <w:tcBorders>
+              <w:top w:val="single" w:color="C9D2DE" w:sz="4"/>
+              <w:left w:val="single" w:color="C9D2DE" w:sz="4"/>
+              <w:bottom w:val="single" w:color="C9D2DE" w:sz="4"/>
+              <w:right w:val="single" w:color="C9D2DE" w:sz="4"/>
+            </w:tcBorders>
+            <w:tcMar>
+              <w:top w:type="dxa" w:w="50"/>
+              <w:left w:type="dxa" w:w="90"/>
+              <w:bottom w:type="dxa" w:w="50"/>
+              <w:right w:type="dxa" w:w="90"/>
+            </w:tcMar>
+            <w:vAlign w:val="top"/>
+          </w:tcPr>
+          <w:p>
+            <w:pPr>
+              <w:keepNext w:val="false"/>
+              <w:spacing w:after="20" w:line="260"/>
+            </w:pPr>
+            <w:r>
+              <w:rPr>
+                <w:sz w:val="18"/>
+                <w:szCs w:val="18"/>
+              </w:rPr>
+              <w:t xml:space="preserve">Stripe keys and </w:t>
+            </w:r>
+            <w:r>
+              <w:rPr>
+                <w:rFonts w:ascii="Consolas" w:cs="Consolas" w:eastAsia="Consolas" w:hAnsi="Consolas"/>
+                <w:color w:val="0B4F8C"/>
+                <w:sz w:val="16"/>
+                <w:szCs w:val="16"/>
+              </w:rPr>
+              <w:t xml:space="preserve">PAYMENT_PROVIDER=stripe</w:t>
+            </w:r>
+          </w:p>
+        </w:tc>
+        <w:tc>
+          <w:tcPr>
+            <w:tcW w:type="dxa" w:w="2179"/>
+            <w:tcBorders>
+              <w:top w:val="single" w:color="C9D2DE" w:sz="4"/>
+              <w:left w:val="single" w:color="C9D2DE" w:sz="4"/>
+              <w:bottom w:val="single" w:color="C9D2DE" w:sz="4"/>
+              <w:right w:val="single" w:color="C9D2DE" w:sz="4"/>
+            </w:tcBorders>
+            <w:tcMar>
+              <w:top w:type="dxa" w:w="50"/>
+              <w:left w:type="dxa" w:w="90"/>
+              <w:bottom w:type="dxa" w:w="50"/>
+              <w:right w:type="dxa" w:w="90"/>
+            </w:tcMar>
+            <w:vAlign w:val="top"/>
+          </w:tcPr>
+          <w:p>
+            <w:pPr>
+              <w:keepNext w:val="false"/>
+              <w:spacing w:after="20" w:line="260"/>
+            </w:pPr>
+            <w:r>
+              <w:rPr>
+                <w:sz w:val="18"/>
+                <w:szCs w:val="18"/>
+              </w:rPr>
+              <w:t xml:space="preserve">Render → Environment</w:t>
+            </w:r>
+          </w:p>
+        </w:tc>
+        <w:tc>
+          <w:tcPr>
+            <w:tcW w:type="dxa" w:w="3567"/>
+            <w:tcBorders>
+              <w:top w:val="single" w:color="C9D2DE" w:sz="4"/>
+              <w:left w:val="single" w:color="C9D2DE" w:sz="4"/>
+              <w:bottom w:val="single" w:color="C9D2DE" w:sz="4"/>
+              <w:right w:val="single" w:color="C9D2DE" w:sz="4"/>
+            </w:tcBorders>
+            <w:tcMar>
+              <w:top w:type="dxa" w:w="50"/>
+              <w:left w:type="dxa" w:w="90"/>
+              <w:bottom w:type="dxa" w:w="50"/>
+              <w:right w:type="dxa" w:w="90"/>
+            </w:tcMar>
+            <w:vAlign w:val="top"/>
+          </w:tcPr>
+          <w:p>
+            <w:pPr>
+              <w:keepNext w:val="false"/>
+              <w:spacing w:after="20" w:line="260"/>
+            </w:pPr>
+            <w:r>
+              <w:rPr>
+                <w:sz w:val="18"/>
+                <w:szCs w:val="18"/>
+              </w:rPr>
+              <w:t xml:space="preserve">Until then card payments use the demo checkout.</w:t>
+            </w:r>
+          </w:p>
+        </w:tc>
+      </w:tr>
+      <w:tr>
+        <w:trPr>
+          <w:cantSplit/>
+        </w:trPr>
+        <w:tc>
+          <w:tcPr>
+            <w:tcW w:type="dxa" w:w="396"/>
+            <w:tcBorders>
+              <w:top w:val="single" w:color="C9D2DE" w:sz="4"/>
+              <w:left w:val="single" w:color="C9D2DE" w:sz="4"/>
+              <w:bottom w:val="single" w:color="C9D2DE" w:sz="4"/>
+              <w:right w:val="single" w:color="C9D2DE" w:sz="4"/>
+            </w:tcBorders>
+            <w:shd w:fill="F7F9FC" w:color="auto" w:val="clear"/>
+            <w:tcMar>
+              <w:top w:type="dxa" w:w="50"/>
+              <w:left w:type="dxa" w:w="90"/>
+              <w:bottom w:type="dxa" w:w="50"/>
+              <w:right w:type="dxa" w:w="90"/>
+            </w:tcMar>
+            <w:vAlign w:val="top"/>
+          </w:tcPr>
+          <w:p>
+            <w:pPr>
+              <w:keepNext w:val="false"/>
+              <w:spacing w:after="20" w:line="260"/>
+            </w:pPr>
+            <w:r>
+              <w:rPr>
+                <w:sz w:val="18"/>
+                <w:szCs w:val="18"/>
+              </w:rPr>
+              <w:t xml:space="preserve">10</w:t>
+            </w:r>
+          </w:p>
+        </w:tc>
+        <w:tc>
+          <w:tcPr>
+            <w:tcW w:type="dxa" w:w="3764"/>
+            <w:tcBorders>
+              <w:top w:val="single" w:color="C9D2DE" w:sz="4"/>
+              <w:left w:val="single" w:color="C9D2DE" w:sz="4"/>
+              <w:bottom w:val="single" w:color="C9D2DE" w:sz="4"/>
+              <w:right w:val="single" w:color="C9D2DE" w:sz="4"/>
+            </w:tcBorders>
+            <w:shd w:fill="F7F9FC" w:color="auto" w:val="clear"/>
+            <w:tcMar>
+              <w:top w:type="dxa" w:w="50"/>
+              <w:left w:type="dxa" w:w="90"/>
+              <w:bottom w:type="dxa" w:w="50"/>
+              <w:right w:type="dxa" w:w="90"/>
+            </w:tcMar>
+            <w:vAlign w:val="top"/>
+          </w:tcPr>
+          <w:p>
+            <w:pPr>
+              <w:keepNext w:val="false"/>
+              <w:spacing w:after="20" w:line="260"/>
+            </w:pPr>
+            <w:r>
+              <w:rPr>
+                <w:sz w:val="18"/>
+                <w:szCs w:val="18"/>
+              </w:rPr>
+              <w:t xml:space="preserve">Deactivate the demo users and set </w:t>
+            </w:r>
+            <w:r>
+              <w:rPr>
+                <w:rFonts w:ascii="Consolas" w:cs="Consolas" w:eastAsia="Consolas" w:hAnsi="Consolas"/>
+                <w:color w:val="0B4F8C"/>
+                <w:sz w:val="16"/>
+                <w:szCs w:val="16"/>
+              </w:rPr>
+              <w:t xml:space="preserve">SEED_DEMO=false</w:t>
+            </w:r>
+          </w:p>
+        </w:tc>
+        <w:tc>
+          <w:tcPr>
+            <w:tcW w:type="dxa" w:w="2179"/>
+            <w:tcBorders>
+              <w:top w:val="single" w:color="C9D2DE" w:sz="4"/>
+              <w:left w:val="single" w:color="C9D2DE" w:sz="4"/>
+              <w:bottom w:val="single" w:color="C9D2DE" w:sz="4"/>
+              <w:right w:val="single" w:color="C9D2DE" w:sz="4"/>
+            </w:tcBorders>
+            <w:shd w:fill="F7F9FC" w:color="auto" w:val="clear"/>
+            <w:tcMar>
+              <w:top w:type="dxa" w:w="50"/>
+              <w:left w:type="dxa" w:w="90"/>
+              <w:bottom w:type="dxa" w:w="50"/>
+              <w:right w:type="dxa" w:w="90"/>
+            </w:tcMar>
+            <w:vAlign w:val="top"/>
+          </w:tcPr>
+          <w:p>
+            <w:pPr>
+              <w:keepNext w:val="false"/>
+              <w:spacing w:after="20" w:line="260"/>
+            </w:pPr>
+            <w:r>
+              <w:rPr>
+                <w:sz w:val="18"/>
+                <w:szCs w:val="18"/>
+              </w:rPr>
+              <w:t xml:space="preserve">Settings → Users, Render</w:t>
+            </w:r>
+          </w:p>
+        </w:tc>
+        <w:tc>
+          <w:tcPr>
+            <w:tcW w:type="dxa" w:w="3567"/>
+            <w:tcBorders>
+              <w:top w:val="single" w:color="C9D2DE" w:sz="4"/>
+              <w:left w:val="single" w:color="C9D2DE" w:sz="4"/>
+              <w:bottom w:val="single" w:color="C9D2DE" w:sz="4"/>
+              <w:right w:val="single" w:color="C9D2DE" w:sz="4"/>
+            </w:tcBorders>
+            <w:shd w:fill="F7F9FC" w:color="auto" w:val="clear"/>
+            <w:tcMar>
+              <w:top w:type="dxa" w:w="50"/>
+              <w:left w:type="dxa" w:w="90"/>
+              <w:bottom w:type="dxa" w:w="50"/>
+              <w:right w:type="dxa" w:w="90"/>
+            </w:tcMar>
+            <w:vAlign w:val="top"/>
+          </w:tcPr>
+          <w:p>
+            <w:pPr>
+              <w:keepNext w:val="false"/>
+              <w:spacing w:after="20" w:line="260"/>
+            </w:pPr>
+            <w:r>
+              <w:rPr>
+                <w:sz w:val="18"/>
+                <w:szCs w:val="18"/>
+              </w:rPr>
+              <w:t xml:space="preserve">Removes the test accounts.</w:t>
+            </w:r>
+          </w:p>
+        </w:tc>
+      </w:tr>
+    </w:tbl>
+    <w:p>
+      <w:pPr>
+        <w:spacing w:after="160"/>
+      </w:pPr>
+    </w:p>
+    <w:tbl>
+      <w:tblPr>
+        <w:tblW w:type="dxa" w:w="9906"/>
+        <w:tblBorders>
+          <w:top w:val="single" w:color="auto" w:sz="4"/>
+          <w:left w:val="single" w:color="auto" w:sz="4"/>
+          <w:bottom w:val="single" w:color="auto" w:sz="4"/>
+          <w:right w:val="single" w:color="auto" w:sz="4"/>
+          <w:insideH w:val="single" w:color="auto" w:sz="4"/>
+          <w:insideV w:val="single" w:color="auto" w:sz="4"/>
+        </w:tblBorders>
+      </w:tblPr>
+      <w:tblGrid>
+        <w:gridCol w:w="9906"/>
+      </w:tblGrid>
+      <w:tr>
+        <w:trPr>
+          <w:cantSplit/>
+        </w:trPr>
+        <w:tc>
+          <w:tcPr>
+            <w:tcW w:type="dxa" w:w="9906"/>
+            <w:tcBorders>
+              <w:top w:val="none" w:color="FFFFFF" w:sz="0"/>
+              <w:left w:val="single" w:color="8C5A36" w:sz="24"/>
+              <w:bottom w:val="none" w:color="FFFFFF" w:sz="0"/>
+              <w:right w:val="none" w:color="FFFFFF" w:sz="0"/>
+            </w:tcBorders>
+            <w:shd w:fill="F4ECE4" w:color="auto" w:val="clear"/>
+            <w:tcMar>
+              <w:top w:type="dxa" w:w="120"/>
+              <w:left w:type="dxa" w:w="200"/>
+              <w:bottom w:type="dxa" w:w="120"/>
+              <w:right w:type="dxa" w:w="200"/>
+            </w:tcMar>
+          </w:tcPr>
+          <w:p>
+            <w:pPr>
+              <w:spacing w:after="80"/>
+            </w:pPr>
+            <w:r>
+              <w:rPr>
+                <w:b/>
+                <w:bCs/>
+                <w:color w:val="0A1F4A"/>
+                <w:sz w:val="22"/>
+                <w:szCs w:val="22"/>
+              </w:rPr>
+              <w:t xml:space="preserve">After every update</w:t>
+            </w:r>
+          </w:p>
+          <w:p>
+            <w:pPr>
+              <w:spacing w:after="60" w:line="280"/>
+            </w:pPr>
+            <w:r>
+              <w:rPr>
+                <w:sz w:val="20"/>
+                <w:szCs w:val="20"/>
+              </w:rPr>
+              <w:t xml:space="preserve">On Render choose </w:t>
+            </w:r>
+            <w:r>
+              <w:rPr>
+                <w:b/>
+                <w:bCs/>
+                <w:sz w:val="20"/>
+                <w:szCs w:val="20"/>
+              </w:rPr>
+              <w:t xml:space="preserve">Manual Deploy → Deploy latest commit</w:t>
+            </w:r>
+            <w:r>
+              <w:rPr>
+                <w:sz w:val="20"/>
+                <w:szCs w:val="20"/>
+              </w:rPr>
+              <w:t xml:space="preserve">. The app upgrades the database by itself and keeps all data; the log shows a line starting with "[db] upgraded database" when it adds something.</w:t>
             </w:r>
           </w:p>
         </w:tc>
@@ -21266,17 +22982,83 @@
         <w:spacing w:after="60" w:line="290"/>
       </w:pPr>
       <w:r>
-        <w:t xml:space="preserve">Acceptance triggers the </w:t>
+        <w:t xml:space="preserve">Acceptance (online, or recorded by the office for a phone or email acceptance) </w:t>
       </w:r>
       <w:r>
         <w:rPr>
           <w:b/>
           <w:bCs/>
         </w:rPr>
-        <w:t xml:space="preserve">service agreement</w:t>
-      </w:r>
-      <w:r>
-        <w:t xml:space="preserve">, which the client signs online (typed name) before paying.</w:t>
+        <w:t xml:space="preserve">emails the client the signing link</w:t>
+      </w:r>
+      <w:r>
+        <w:t xml:space="preserve"> for the service agreement, which the client signs online (typed name, optional drawn signature) before paying.</w:t>
+      </w:r>
+    </w:p>
+    <w:p>
+      <w:pPr>
+        <w:pStyle w:val="ListParagraph"/>
+        <w:numPr>
+          <w:ilvl w:val="0"/>
+          <w:numId w:val="2"/>
+        </w:numPr>
+        <w:spacing w:after="60" w:line="290"/>
+      </w:pPr>
+      <w:r>
+        <w:t xml:space="preserve">The job page shows the </w:t>
+      </w:r>
+      <w:r>
+        <w:rPr>
+          <w:b/>
+          <w:bCs/>
+        </w:rPr>
+        <w:t xml:space="preserve">client link</w:t>
+      </w:r>
+      <w:r>
+        <w:t xml:space="preserve"> with Copy, Open as the client and WhatsApp, plus </w:t>
+      </w:r>
+      <w:r>
+        <w:rPr>
+          <w:b/>
+          <w:bCs/>
+        </w:rPr>
+        <w:t xml:space="preserve">Email the signing link</w:t>
+      </w:r>
+      <w:r>
+        <w:t xml:space="preserve"> (resend) and </w:t>
+      </w:r>
+      <w:r>
+        <w:rPr>
+          <w:b/>
+          <w:bCs/>
+        </w:rPr>
+        <w:t xml:space="preserve">Record signature (signed on paper)</w:t>
+      </w:r>
+      <w:r>
+        <w:t xml:space="preserve">.</w:t>
+      </w:r>
+    </w:p>
+    <w:p>
+      <w:pPr>
+        <w:pStyle w:val="ListParagraph"/>
+        <w:numPr>
+          <w:ilvl w:val="0"/>
+          <w:numId w:val="2"/>
+        </w:numPr>
+        <w:spacing w:after="60" w:line="290"/>
+      </w:pPr>
+      <w:r>
+        <w:t xml:space="preserve">Every job page shows a </w:t>
+      </w:r>
+      <w:r>
+        <w:rPr>
+          <w:b/>
+          <w:bCs/>
+        </w:rPr>
+        <w:t xml:space="preserve">Next step</w:t>
+      </w:r>
+      <w:r>
+        <w:t xml:space="preserve"> line for its status, so the office always knows what to do.</w:t>
       </w:r>
     </w:p>
     <w:p>
@@ -22162,7 +23944,7 @@
         <w:t xml:space="preserve">"DEMO – no real payment"</w:t>
       </w:r>
       <w:r>
-        <w:t xml:space="preserve"> banner. In demo mode, payment links are never sent to real clients; admins test with "Test online payment".</w:t>
+        <w:t xml:space="preserve"> banner.</w:t>
       </w:r>
     </w:p>
     <w:p>
@@ -22175,31 +23957,34 @@
         <w:spacing w:after="60" w:line="290"/>
       </w:pPr>
       <w:r>
-        <w:t xml:space="preserve">Switching to Stripe later (</w:t>
-      </w:r>
-      <w:r>
         <w:rPr>
-          <w:rFonts w:ascii="Consolas" w:cs="Consolas" w:eastAsia="Consolas" w:hAnsi="Consolas"/>
-          <w:color w:val="0B4F8C"/>
-          <w:sz w:val="19"/>
-          <w:szCs w:val="19"/>
+          <w:b/>
+          <w:bCs/>
         </w:rPr>
-        <w:t xml:space="preserve">STRIPE_SECRET_KEY</w:t>
-      </w:r>
-      <w:r>
-        <w:t xml:space="preserve">, </w:t>
+        <w:t xml:space="preserve">Payment on behalf of the client:</w:t>
+      </w:r>
+      <w:r>
+        <w:t xml:space="preserve"> on the job (and invoice) page the office presses </w:t>
       </w:r>
       <w:r>
         <w:rPr>
-          <w:rFonts w:ascii="Consolas" w:cs="Consolas" w:eastAsia="Consolas" w:hAnsi="Consolas"/>
-          <w:color w:val="0B4F8C"/>
-          <w:sz w:val="19"/>
-          <w:szCs w:val="19"/>
+          <w:b/>
+          <w:bCs/>
         </w:rPr>
-        <w:t xml:space="preserve">STRIPE_WEBHOOK_SECRET</w:t>
-      </w:r>
-      <w:r>
-        <w:t xml:space="preserve">) or adding N-Genius or Telr must not change any other code.</w:t>
+        <w:t xml:space="preserve">Pay by card</w:t>
+      </w:r>
+      <w:r>
+        <w:t xml:space="preserve"> to open the same checkout for the client, by phone or at the office; afterwards it returns to the job and the payment is recorded under the staff member. </w:t>
+      </w:r>
+      <w:r>
+        <w:rPr>
+          <w:b/>
+          <w:bCs/>
+        </w:rPr>
+        <w:t xml:space="preserve">Record payment</w:t>
+      </w:r>
+      <w:r>
+        <w:t xml:space="preserve"> covers bank transfer, cheque, cash and card machine.</w:t>
       </w:r>
     </w:p>
     <w:p>
@@ -22212,7 +23997,31 @@
         <w:spacing w:after="60" w:line="290"/>
       </w:pPr>
       <w:r>
-        <w:t xml:space="preserve">Full amount or deposit; receipt PDF emailed on payment.</w:t>
+        <w:t xml:space="preserve">Switching to Stripe later (</w:t>
+      </w:r>
+      <w:r>
+        <w:rPr>
+          <w:rFonts w:ascii="Consolas" w:cs="Consolas" w:eastAsia="Consolas" w:hAnsi="Consolas"/>
+          <w:color w:val="0B4F8C"/>
+          <w:sz w:val="19"/>
+          <w:szCs w:val="19"/>
+        </w:rPr>
+        <w:t xml:space="preserve">STRIPE_SECRET_KEY</w:t>
+      </w:r>
+      <w:r>
+        <w:t xml:space="preserve">, </w:t>
+      </w:r>
+      <w:r>
+        <w:rPr>
+          <w:rFonts w:ascii="Consolas" w:cs="Consolas" w:eastAsia="Consolas" w:hAnsi="Consolas"/>
+          <w:color w:val="0B4F8C"/>
+          <w:sz w:val="19"/>
+          <w:szCs w:val="19"/>
+        </w:rPr>
+        <w:t xml:space="preserve">STRIPE_WEBHOOK_SECRET</w:t>
+      </w:r>
+      <w:r>
+        <w:t xml:space="preserve">) or adding N-Genius or Telr must not change any other code.</w:t>
       </w:r>
     </w:p>
     <w:p>
@@ -22225,7 +24034,7 @@
         <w:spacing w:after="60" w:line="290"/>
       </w:pPr>
       <w:r>
-        <w:t xml:space="preserve">Bank transfer, cheque and cash recorded by the Accountant with proof of payment.</w:t>
+        <w:t xml:space="preserve">Full amount or deposit; receipt PDF emailed on payment.</w:t>
       </w:r>
     </w:p>
     <w:p>
@@ -22238,7 +24047,7 @@
         <w:spacing w:after="60" w:line="290"/>
       </w:pPr>
       <w:r>
-        <w:t xml:space="preserve">Partial payments, refunds through credit notes, and a payment ledger per job and per client.</w:t>
+        <w:t xml:space="preserve">Bank transfer, cheque and cash recorded by the Accountant with proof of payment.</w:t>
       </w:r>
     </w:p>
     <w:p>
@@ -22251,24 +24060,7 @@
         <w:spacing w:after="60" w:line="290"/>
       </w:pPr>
       <w:r>
-        <w:t xml:space="preserve">Live gateway: verify webhook signatures and process each payment once only. Never store card details.</w:t>
-      </w:r>
-    </w:p>
-    <w:p>
-      <w:pPr>
-        <w:pStyle w:val="Heading1"/>
-        <w:spacing w:after="200" w:before="480"/>
-      </w:pPr>
-      <w:r>
-        <w:t xml:space="preserve">11. Scheduling and the inspection app</w:t>
-      </w:r>
-    </w:p>
-    <w:p>
-      <w:pPr>
-        <w:pStyle w:val="Heading2"/>
-      </w:pPr>
-      <w:r>
-        <w:t xml:space="preserve">11.1 Scheduling</w:t>
+        <w:t xml:space="preserve">Partial payments, refunds through credit notes, and a payment ledger per job and per client.</w:t>
       </w:r>
     </w:p>
     <w:p>
@@ -22281,7 +24073,24 @@
         <w:spacing w:after="60" w:line="290"/>
       </w:pPr>
       <w:r>
-        <w:t xml:space="preserve">Assign by area, availability and qualification (for example thermal-certified). One calendar per inspector; no double-booking.</w:t>
+        <w:t xml:space="preserve">Live gateway: verify webhook signatures and process each payment once only. Never store card details.</w:t>
+      </w:r>
+    </w:p>
+    <w:p>
+      <w:pPr>
+        <w:pStyle w:val="Heading1"/>
+        <w:spacing w:after="200" w:before="480"/>
+      </w:pPr>
+      <w:r>
+        <w:t xml:space="preserve">11. Scheduling and the inspection app</w:t>
+      </w:r>
+    </w:p>
+    <w:p>
+      <w:pPr>
+        <w:pStyle w:val="Heading2"/>
+      </w:pPr>
+      <w:r>
+        <w:t xml:space="preserve">11.1 Scheduling</w:t>
       </w:r>
     </w:p>
     <w:p>
@@ -22294,7 +24103,7 @@
         <w:spacing w:after="60" w:line="290"/>
       </w:pPr>
       <w:r>
-        <w:t xml:space="preserve">Inspectors with an expired licence, insurance or agreement cannot be assigned.</w:t>
+        <w:t xml:space="preserve">Assign by area, availability and qualification (for example thermal-certified). One calendar per inspector; no double-booking.</w:t>
       </w:r>
     </w:p>
     <w:p>
@@ -22307,7 +24116,7 @@
         <w:spacing w:after="60" w:line="290"/>
       </w:pPr>
       <w:r>
-        <w:t xml:space="preserve">Equipment is booked with the job; a thermal job needs a free thermal camera within its calibration date.</w:t>
+        <w:t xml:space="preserve">Inspectors with an expired licence, insurance or agreement cannot be assigned.</w:t>
       </w:r>
     </w:p>
     <w:p>
@@ -22320,15 +24129,7 @@
         <w:spacing w:after="60" w:line="290"/>
       </w:pPr>
       <w:r>
-        <w:t xml:space="preserve">Confirmation email (with a WhatsApp link) with date, time and inspector, and a reminder the day before.</w:t>
-      </w:r>
-    </w:p>
-    <w:p>
-      <w:pPr>
-        <w:pStyle w:val="Heading2"/>
-      </w:pPr>
-      <w:r>
-        <w:t xml:space="preserve">11.2 Inspection app on the phone</w:t>
+        <w:t xml:space="preserve">Equipment is booked with the job; a thermal job needs a free thermal camera within its calibration date.</w:t>
       </w:r>
     </w:p>
     <w:p>
@@ -22341,7 +24142,7 @@
         <w:spacing w:after="60" w:line="290"/>
       </w:pPr>
       <w:r>
-        <w:t xml:space="preserve">Installed from the browser to the home screen on iPhone and Android. No App Store release.</w:t>
+        <w:t xml:space="preserve">Confirmation email with a calendar invite (.ics) to the client and the inspector.</w:t>
       </w:r>
     </w:p>
     <w:p>
@@ -22354,7 +24155,17 @@
         <w:spacing w:after="60" w:line="290"/>
       </w:pPr>
       <w:r>
-        <w:t xml:space="preserve">Works offline: everything is saved on the phone and synced when there is signal. Nothing is lost if the app closes.</w:t>
+        <w:t xml:space="preserve">The </w:t>
+      </w:r>
+      <w:r>
+        <w:rPr>
+          <w:b/>
+          <w:bCs/>
+        </w:rPr>
+        <w:t xml:space="preserve">inspection is created when the job is paid</w:t>
+      </w:r>
+      <w:r>
+        <w:t xml:space="preserve"> (or when a credit client signs), with rooms built from the bedroom count; paid jobs wait under Inspections as "Paid, waiting to be scheduled".</w:t>
       </w:r>
     </w:p>
     <w:p>
@@ -22367,7 +24178,32 @@
         <w:spacing w:after="60" w:line="290"/>
       </w:pPr>
       <w:r>
-        <w:t xml:space="preserve">Check-in records arrival time and GPS and starts the SLA clock. "No access" records the reason with a photo.</w:t>
+        <w:rPr>
+          <w:b/>
+          <w:bCs/>
+        </w:rPr>
+        <w:t xml:space="preserve">Calendar:</w:t>
+      </w:r>
+      <w:r>
+        <w:t xml:space="preserve"> week view </w:t>
+      </w:r>
+      <w:r>
+        <w:rPr>
+          <w:b/>
+          <w:bCs/>
+        </w:rPr>
+        <w:t xml:space="preserve">Monday to Sunday</w:t>
+      </w:r>
+      <w:r>
+        <w:t xml:space="preserve"> with hour rows, Prev / Today / Next, colour legend, list view on phones, filter by inspector, a "Coming up after this week" list, and "Show in calendar" from the job. Private subscription links for Outlook / Google: one for the office, one per inspector.</w:t>
+      </w:r>
+    </w:p>
+    <w:p>
+      <w:pPr>
+        <w:pStyle w:val="Heading2"/>
+      </w:pPr>
+      <w:r>
+        <w:t xml:space="preserve">11.2 Inspection app on the phone</w:t>
       </w:r>
     </w:p>
     <w:p>
@@ -22380,7 +24216,7 @@
         <w:spacing w:after="60" w:line="290"/>
       </w:pPr>
       <w:r>
-        <w:t xml:space="preserve">Rooms are built from the checklist and the bedroom count; the inspector can add, rename or remove rooms.</w:t>
+        <w:t xml:space="preserve">Installed from the browser to the home screen on iPhone and Android. No App Store release.</w:t>
       </w:r>
     </w:p>
     <w:p>
@@ -22393,7 +24229,7 @@
         <w:spacing w:after="60" w:line="290"/>
       </w:pPr>
       <w:r>
-        <w:t xml:space="preserve">For each item: ready-made finding or free text, severity, recommended trade, photos, videos and thermal images.</w:t>
+        <w:t xml:space="preserve">Works offline: everything is saved on the phone and synced when there is signal. Nothing is lost if the app closes.</w:t>
       </w:r>
     </w:p>
     <w:p>
@@ -22406,14 +24242,7 @@
         <w:spacing w:after="60" w:line="290"/>
       </w:pPr>
       <w:r>
-        <w:rPr>
-          <w:b/>
-          <w:bCs/>
-        </w:rPr>
-        <w:t xml:space="preserve">Take photo, Add from gallery, Record video</w:t>
-      </w:r>
-      <w:r>
-        <w:t xml:space="preserve"> (up to 60 seconds) on every finding; mark-up with red arrows, circles and text.</w:t>
+        <w:t xml:space="preserve">Check-in records arrival time and GPS and starts the SLA clock. "No access" records the reason with a photo.</w:t>
       </w:r>
     </w:p>
     <w:p>
@@ -22426,7 +24255,7 @@
         <w:spacing w:after="60" w:line="290"/>
       </w:pPr>
       <w:r>
-        <w:t xml:space="preserve">Photos are reduced on the phone (about 1,600 px) so 200+ photos upload over mobile data.</w:t>
+        <w:t xml:space="preserve">Rooms are built from the checklist and the bedroom count; the inspector can add, rename, reorder or remove rooms, and mark a room "not inspected" with the reason.</w:t>
       </w:r>
     </w:p>
     <w:p>
@@ -22443,10 +24272,10 @@
           <w:b/>
           <w:bCs/>
         </w:rPr>
-        <w:t xml:space="preserve">Quick mode:</w:t>
-      </w:r>
-      <w:r>
-        <w:t xml:space="preserve"> take all the photos room by room first, then link them to findings.</w:t>
+        <w:t xml:space="preserve">System sections have their own items and picklists:</w:t>
+      </w:r>
+      <w:r>
+        <w:t xml:space="preserve"> Air Conditioning (system type, thermostats, cooling performance, outlets, indoor units / FCU, condensate drain, filters, ductwork insulation, outdoor units); Electrical (main service, distribution board, breakers and RCD, sockets and switches, earthing, lighting); Water Heater (type, condition, hot water temperature, supply lines, relief valve). Material lists such as tile or marble appear only in rooms.</w:t>
       </w:r>
     </w:p>
     <w:p>
@@ -22459,16 +24288,14 @@
         <w:spacing w:after="60" w:line="290"/>
       </w:pPr>
       <w:r>
-        <w:t xml:space="preserve">Client or tenant signature on site for move-in and move-out reports.</w:t>
-      </w:r>
-    </w:p>
-    <w:p>
-      <w:pPr>
-        <w:pStyle w:val="Heading1"/>
-        <w:spacing w:after="200" w:before="480"/>
-      </w:pPr>
-      <w:r>
-        <w:t xml:space="preserve">12. Reports and technical review</w:t>
+        <w:rPr>
+          <w:b/>
+          <w:bCs/>
+        </w:rPr>
+        <w:t xml:space="preserve">Attachments:</w:t>
+      </w:r>
+      <w:r>
+        <w:t xml:space="preserve"> PDF, JPEG or PNG documents up to 20 MB (lab results, floor plans, DEWA bills, the developer snag list), numbered A1, A2…</w:t>
       </w:r>
     </w:p>
     <w:p>
@@ -22481,14 +24308,7 @@
         <w:spacing w:after="60" w:line="290"/>
       </w:pPr>
       <w:r>
-        <w:rPr>
-          <w:b/>
-          <w:bCs/>
-        </w:rPr>
-        <w:t xml:space="preserve">Report types:</w:t>
-      </w:r>
-      <w:r>
-        <w:t xml:space="preserve"> resale, snagging and handover (also used for the bank buyer handover programme and the developer pre-handover quality check), move-in / move-out, repossessed or distressed asset, and defect-period tracking (a re-inspection report).</w:t>
+        <w:t xml:space="preserve">For each item: ready-made finding or free text, severity, recommended trade, photos, videos and thermal images.</w:t>
       </w:r>
     </w:p>
     <w:p>
@@ -22505,10 +24325,10 @@
           <w:b/>
           <w:bCs/>
         </w:rPr>
-        <w:t xml:space="preserve">Two-step review:</w:t>
-      </w:r>
-      <w:r>
-        <w:t xml:space="preserve"> the inspector submits, the Technical Manager approves or returns it with comments. Once issued, the report is locked; a correction creates a new version.</w:t>
+        <w:t xml:space="preserve">Take photo, Add from gallery, Record video</w:t>
+      </w:r>
+      <w:r>
+        <w:t xml:space="preserve"> (up to 60 seconds) on every finding; mark-up with red arrows, circles and text.</w:t>
       </w:r>
     </w:p>
     <w:p>
@@ -22521,19 +24341,7 @@
         <w:spacing w:after="60" w:line="290"/>
       </w:pPr>
       <w:r>
-        <w:t xml:space="preserve">Report number </w:t>
-      </w:r>
-      <w:r>
-        <w:rPr>
-          <w:rFonts w:ascii="Consolas" w:cs="Consolas" w:eastAsia="Consolas" w:hAnsi="Consolas"/>
-          <w:color w:val="0B4F8C"/>
-          <w:sz w:val="19"/>
-          <w:szCs w:val="19"/>
-        </w:rPr>
-        <w:t xml:space="preserve">RPT-2026-00001</w:t>
-      </w:r>
-      <w:r>
-        <w:t xml:space="preserve"> and a QR code that opens a verification page (number, date, property, valid or replaced).</w:t>
+        <w:t xml:space="preserve">Photos are reduced on the phone (about 1,600 px) so 200+ photos upload over mobile data.</w:t>
       </w:r>
     </w:p>
     <w:p>
@@ -22550,10 +24358,10 @@
           <w:b/>
           <w:bCs/>
         </w:rPr>
-        <w:t xml:space="preserve">Re-inspection:</w:t>
-      </w:r>
-      <w:r>
-        <w:t xml:space="preserve"> a linked job where each original finding is marked Fixed, Not fixed or Partly fixed, with before and after photos.</w:t>
+        <w:t xml:space="preserve">Quick mode:</w:t>
+      </w:r>
+      <w:r>
+        <w:t xml:space="preserve"> take all the photos room by room first, then link them to findings.</w:t>
       </w:r>
     </w:p>
     <w:p>
@@ -22566,6 +24374,113 @@
         <w:spacing w:after="60" w:line="290"/>
       </w:pPr>
       <w:r>
+        <w:t xml:space="preserve">Client or tenant signature on site for move-in and move-out reports.</w:t>
+      </w:r>
+    </w:p>
+    <w:p>
+      <w:pPr>
+        <w:pStyle w:val="Heading1"/>
+        <w:spacing w:after="200" w:before="480"/>
+      </w:pPr>
+      <w:r>
+        <w:t xml:space="preserve">12. Reports and technical review</w:t>
+      </w:r>
+    </w:p>
+    <w:p>
+      <w:pPr>
+        <w:pStyle w:val="ListParagraph"/>
+        <w:numPr>
+          <w:ilvl w:val="0"/>
+          <w:numId w:val="2"/>
+        </w:numPr>
+        <w:spacing w:after="60" w:line="290"/>
+      </w:pPr>
+      <w:r>
+        <w:rPr>
+          <w:b/>
+          <w:bCs/>
+        </w:rPr>
+        <w:t xml:space="preserve">Report types:</w:t>
+      </w:r>
+      <w:r>
+        <w:t xml:space="preserve"> resale, snagging and handover (also used for the bank buyer handover programme and the developer pre-handover quality check), move-in / move-out, repossessed or distressed asset, and defect-period tracking (a re-inspection report).</w:t>
+      </w:r>
+    </w:p>
+    <w:p>
+      <w:pPr>
+        <w:pStyle w:val="ListParagraph"/>
+        <w:numPr>
+          <w:ilvl w:val="0"/>
+          <w:numId w:val="2"/>
+        </w:numPr>
+        <w:spacing w:after="60" w:line="290"/>
+      </w:pPr>
+      <w:r>
+        <w:rPr>
+          <w:b/>
+          <w:bCs/>
+        </w:rPr>
+        <w:t xml:space="preserve">Two-step review:</w:t>
+      </w:r>
+      <w:r>
+        <w:t xml:space="preserve"> the inspector submits, the Technical Manager approves or returns it with comments. Once issued, the report is locked; a correction creates a new version.</w:t>
+      </w:r>
+    </w:p>
+    <w:p>
+      <w:pPr>
+        <w:pStyle w:val="ListParagraph"/>
+        <w:numPr>
+          <w:ilvl w:val="0"/>
+          <w:numId w:val="2"/>
+        </w:numPr>
+        <w:spacing w:after="60" w:line="290"/>
+      </w:pPr>
+      <w:r>
+        <w:t xml:space="preserve">Report number </w:t>
+      </w:r>
+      <w:r>
+        <w:rPr>
+          <w:rFonts w:ascii="Consolas" w:cs="Consolas" w:eastAsia="Consolas" w:hAnsi="Consolas"/>
+          <w:color w:val="0B4F8C"/>
+          <w:sz w:val="19"/>
+          <w:szCs w:val="19"/>
+        </w:rPr>
+        <w:t xml:space="preserve">RPT-2026-00001</w:t>
+      </w:r>
+      <w:r>
+        <w:t xml:space="preserve"> and a QR code that opens a verification page (number, date, property, valid or replaced).</w:t>
+      </w:r>
+    </w:p>
+    <w:p>
+      <w:pPr>
+        <w:pStyle w:val="ListParagraph"/>
+        <w:numPr>
+          <w:ilvl w:val="0"/>
+          <w:numId w:val="2"/>
+        </w:numPr>
+        <w:spacing w:after="60" w:line="290"/>
+      </w:pPr>
+      <w:r>
+        <w:rPr>
+          <w:b/>
+          <w:bCs/>
+        </w:rPr>
+        <w:t xml:space="preserve">Re-inspection:</w:t>
+      </w:r>
+      <w:r>
+        <w:t xml:space="preserve"> a linked job where each original finding is marked Fixed, Not fixed or Partly fixed, with before and after photos.</w:t>
+      </w:r>
+    </w:p>
+    <w:p>
+      <w:pPr>
+        <w:pStyle w:val="ListParagraph"/>
+        <w:numPr>
+          <w:ilvl w:val="0"/>
+          <w:numId w:val="2"/>
+        </w:numPr>
+        <w:spacing w:after="60" w:line="290"/>
+      </w:pPr>
+      <w:r>
         <w:rPr>
           <w:b/>
           <w:bCs/>
@@ -22574,6 +24489,26 @@
       </w:r>
       <w:r>
         <w:t xml:space="preserve"> inspector and Technical Manager names, credentials and signatures, and ARAL’s RERA registration number.</w:t>
+      </w:r>
+    </w:p>
+    <w:p>
+      <w:pPr>
+        <w:pStyle w:val="ListParagraph"/>
+        <w:numPr>
+          <w:ilvl w:val="0"/>
+          <w:numId w:val="2"/>
+        </w:numPr>
+        <w:spacing w:after="60" w:line="290"/>
+      </w:pPr>
+      <w:r>
+        <w:rPr>
+          <w:b/>
+          <w:bCs/>
+        </w:rPr>
+        <w:t xml:space="preserve">Online report:</w:t>
+      </w:r>
+      <w:r>
+        <w:t xml:space="preserve"> the same report as a secure web page with playable videos, full-size photos, attachments to open or download, the PDF, and a 1 to 5 star rating.</w:t>
       </w:r>
     </w:p>
     <w:p>
@@ -23766,7 +25701,7 @@
                 <w:sz w:val="18"/>
                 <w:szCs w:val="18"/>
               </w:rPr>
-              <w:t xml:space="preserve">Air conditioning, electrical, water heater (plus plumbing, life safety, structure when in scope)</w:t>
+              <w:t xml:space="preserve">Air conditioning, electrical, water heater, each with its own items (plus plumbing, life safety, structure when in scope)</w:t>
             </w:r>
           </w:p>
         </w:tc>
@@ -24782,6 +26717,137 @@
                 <w:sz w:val="18"/>
                 <w:szCs w:val="18"/>
               </w:rPr>
+              <w:t xml:space="preserve">Attachments</w:t>
+            </w:r>
+          </w:p>
+        </w:tc>
+        <w:tc>
+          <w:tcPr>
+            <w:tcW w:type="dxa" w:w="5745"/>
+            <w:tcBorders>
+              <w:top w:val="single" w:color="C9D2DE" w:sz="4"/>
+              <w:left w:val="single" w:color="C9D2DE" w:sz="4"/>
+              <w:bottom w:val="single" w:color="C9D2DE" w:sz="4"/>
+              <w:right w:val="single" w:color="C9D2DE" w:sz="4"/>
+            </w:tcBorders>
+            <w:shd w:fill="F7F9FC" w:color="auto" w:val="clear"/>
+            <w:tcMar>
+              <w:top w:type="dxa" w:w="50"/>
+              <w:left w:type="dxa" w:w="90"/>
+              <w:bottom w:type="dxa" w:w="50"/>
+              <w:right w:type="dxa" w:w="90"/>
+            </w:tcMar>
+            <w:vAlign w:val="top"/>
+          </w:tcPr>
+          <w:p>
+            <w:pPr>
+              <w:keepNext w:val="false"/>
+              <w:spacing w:after="20" w:line="260"/>
+            </w:pPr>
+            <w:r>
+              <w:rPr>
+                <w:sz w:val="18"/>
+                <w:szCs w:val="18"/>
+              </w:rPr>
+              <w:t xml:space="preserve">Index A1, A2… with page numbers; images on their own page; PDFs linked by QR code (also emailed with the report)</w:t>
+            </w:r>
+          </w:p>
+        </w:tc>
+        <w:tc>
+          <w:tcPr>
+            <w:tcW w:type="dxa" w:w="1685"/>
+            <w:tcBorders>
+              <w:top w:val="single" w:color="C9D2DE" w:sz="4"/>
+              <w:left w:val="single" w:color="C9D2DE" w:sz="4"/>
+              <w:bottom w:val="single" w:color="C9D2DE" w:sz="4"/>
+              <w:right w:val="single" w:color="C9D2DE" w:sz="4"/>
+            </w:tcBorders>
+            <w:shd w:fill="F7F9FC" w:color="auto" w:val="clear"/>
+            <w:tcMar>
+              <w:top w:type="dxa" w:w="50"/>
+              <w:left w:type="dxa" w:w="90"/>
+              <w:bottom w:type="dxa" w:w="50"/>
+              <w:right w:type="dxa" w:w="90"/>
+            </w:tcMar>
+            <w:vAlign w:val="top"/>
+          </w:tcPr>
+          <w:p>
+            <w:pPr>
+              <w:keepNext w:val="false"/>
+              <w:spacing w:after="20" w:line="260"/>
+            </w:pPr>
+            <w:r>
+              <w:rPr>
+                <w:sz w:val="18"/>
+                <w:szCs w:val="18"/>
+              </w:rPr>
+              <w:t xml:space="preserve">Inspector / office</w:t>
+            </w:r>
+          </w:p>
+        </w:tc>
+      </w:tr>
+      <w:tr>
+        <w:trPr>
+          <w:cantSplit/>
+        </w:trPr>
+        <w:tc>
+          <w:tcPr>
+            <w:tcW w:type="dxa" w:w="495"/>
+            <w:tcBorders>
+              <w:top w:val="single" w:color="C9D2DE" w:sz="4"/>
+              <w:left w:val="single" w:color="C9D2DE" w:sz="4"/>
+              <w:bottom w:val="single" w:color="C9D2DE" w:sz="4"/>
+              <w:right w:val="single" w:color="C9D2DE" w:sz="4"/>
+            </w:tcBorders>
+            <w:tcMar>
+              <w:top w:type="dxa" w:w="50"/>
+              <w:left w:type="dxa" w:w="90"/>
+              <w:bottom w:type="dxa" w:w="50"/>
+              <w:right w:type="dxa" w:w="90"/>
+            </w:tcMar>
+            <w:vAlign w:val="top"/>
+          </w:tcPr>
+          <w:p>
+            <w:pPr>
+              <w:keepNext w:val="false"/>
+              <w:spacing w:after="20" w:line="260"/>
+            </w:pPr>
+            <w:r>
+              <w:rPr>
+                <w:sz w:val="18"/>
+                <w:szCs w:val="18"/>
+              </w:rPr>
+              <w:t xml:space="preserve">17</w:t>
+            </w:r>
+          </w:p>
+        </w:tc>
+        <w:tc>
+          <w:tcPr>
+            <w:tcW w:type="dxa" w:w="1981"/>
+            <w:tcBorders>
+              <w:top w:val="single" w:color="C9D2DE" w:sz="4"/>
+              <w:left w:val="single" w:color="C9D2DE" w:sz="4"/>
+              <w:bottom w:val="single" w:color="C9D2DE" w:sz="4"/>
+              <w:right w:val="single" w:color="C9D2DE" w:sz="4"/>
+            </w:tcBorders>
+            <w:tcMar>
+              <w:top w:type="dxa" w:w="50"/>
+              <w:left w:type="dxa" w:w="90"/>
+              <w:bottom w:type="dxa" w:w="50"/>
+              <w:right w:type="dxa" w:w="90"/>
+            </w:tcMar>
+            <w:vAlign w:val="top"/>
+          </w:tcPr>
+          <w:p>
+            <w:pPr>
+              <w:keepNext w:val="false"/>
+              <w:spacing w:after="20" w:line="260"/>
+            </w:pPr>
+            <w:r>
+              <w:rPr>
+                <w:sz w:val="18"/>
+                <w:szCs w:val="18"/>
+              </w:rPr>
               <w:t xml:space="preserve">Back page</w:t>
             </w:r>
           </w:p>
@@ -24795,7 +26861,6 @@
               <w:bottom w:val="single" w:color="C9D2DE" w:sz="4"/>
               <w:right w:val="single" w:color="C9D2DE" w:sz="4"/>
             </w:tcBorders>
-            <w:shd w:fill="F7F9FC" w:color="auto" w:val="clear"/>
             <w:tcMar>
               <w:top w:type="dxa" w:w="50"/>
               <w:left w:type="dxa" w:w="90"/>
@@ -24827,7 +26892,6 @@
               <w:bottom w:val="single" w:color="C9D2DE" w:sz="4"/>
               <w:right w:val="single" w:color="C9D2DE" w:sz="4"/>
             </w:tcBorders>
-            <w:shd w:fill="F7F9FC" w:color="auto" w:val="clear"/>
             <w:tcMar>
               <w:top w:type="dxa" w:w="50"/>
               <w:left w:type="dxa" w:w="90"/>
@@ -25216,16 +27280,7 @@
         <w:spacing w:after="60" w:line="290"/>
       </w:pPr>
       <w:r>
-        <w:t xml:space="preserve">Statement of account and receivables aging (0–30, 31–60, 61–90, 90+ days); reminders at 7, 14 and 30 days overdue.</w:t>
-      </w:r>
-    </w:p>
-    <w:p>
-      <w:pPr>
-        <w:pStyle w:val="Heading1"/>
-        <w:spacing w:after="200" w:before="480"/>
-      </w:pPr>
-      <w:r>
-        <w:t xml:space="preserve">15. Inspector commission and subcontractors</w:t>
+        <w:t xml:space="preserve">Receivables aging (not due, 1–30, 31–60, 61–90, 90+ days) and automatic overdue reminders (days set in Settings).</w:t>
       </w:r>
     </w:p>
     <w:p>
@@ -25238,7 +27293,16 @@
         <w:spacing w:after="60" w:line="290"/>
       </w:pPr>
       <w:r>
-        <w:t xml:space="preserve">Inspectors are outsourced: their own licence or manpower supplier, agreement and insurance, each with an expiry date.</w:t>
+        <w:t xml:space="preserve">The invoice is issued automatically when the report is issued, unless the client is on monthly invoicing; advance payments are applied, so paid jobs close at once.</w:t>
+      </w:r>
+    </w:p>
+    <w:p>
+      <w:pPr>
+        <w:pStyle w:val="Heading1"/>
+        <w:spacing w:after="200" w:before="480"/>
+      </w:pPr>
+      <w:r>
+        <w:t xml:space="preserve">15. Inspector commission and subcontractors</w:t>
       </w:r>
     </w:p>
     <w:p>
@@ -25251,17 +27315,7 @@
         <w:spacing w:after="60" w:line="290"/>
       </w:pPr>
       <w:r>
-        <w:t xml:space="preserve">Commission is </w:t>
-      </w:r>
-      <w:r>
-        <w:rPr>
-          <w:b/>
-          <w:bCs/>
-        </w:rPr>
-        <w:t xml:space="preserve">42% of the job fee before VAT</w:t>
-      </w:r>
-      <w:r>
-        <w:t xml:space="preserve"> by default, with a rate per inspector or service if needed and an optional bonus.</w:t>
+        <w:t xml:space="preserve">Inspectors are outsourced: their own licence or manpower supplier, agreement and insurance, each with an expiry date.</w:t>
       </w:r>
     </w:p>
     <w:p>
@@ -25274,7 +27328,17 @@
         <w:spacing w:after="60" w:line="290"/>
       </w:pPr>
       <w:r>
-        <w:t xml:space="preserve">Commission becomes payable when the report is issued and, for individuals, the job is paid. It is cancelled if a job is refunded with no visit.</w:t>
+        <w:t xml:space="preserve">Commission is </w:t>
+      </w:r>
+      <w:r>
+        <w:rPr>
+          <w:b/>
+          <w:bCs/>
+        </w:rPr>
+        <w:t xml:space="preserve">42% of the job fee before VAT</w:t>
+      </w:r>
+      <w:r>
+        <w:t xml:space="preserve"> by default, with a rate per inspector or service if needed and an optional bonus.</w:t>
       </w:r>
     </w:p>
     <w:p>
@@ -25287,7 +27351,7 @@
         <w:spacing w:after="60" w:line="290"/>
       </w:pPr>
       <w:r>
-        <w:t xml:space="preserve">Monthly commission statement PDF per inspector and an Excel payout list for the Accountant.</w:t>
+        <w:t xml:space="preserve">Commission becomes payable when the report is issued (individual jobs are always paid before the report can be issued). It is voided if the job is cancelled.</w:t>
       </w:r>
     </w:p>
     <w:p>
@@ -25300,16 +27364,7 @@
         <w:spacing w:after="60" w:line="290"/>
       </w:pPr>
       <w:r>
-        <w:t xml:space="preserve">Specialist subcontractors (concrete testing, pool, waterproofing, drone) recorded as job costs.</w:t>
-      </w:r>
-    </w:p>
-    <w:p>
-      <w:pPr>
-        <w:pStyle w:val="Heading1"/>
-        <w:spacing w:after="200" w:before="480"/>
-      </w:pPr>
-      <w:r>
-        <w:t xml:space="preserve">16. Email</w:t>
+        <w:t xml:space="preserve">Monthly commission statement PDF per inspector and an Excel payout list for the Accountant.</w:t>
       </w:r>
     </w:p>
     <w:p>
@@ -25322,7 +27377,16 @@
         <w:spacing w:after="60" w:line="290"/>
       </w:pPr>
       <w:r>
-        <w:t xml:space="preserve">Sent from Gmail with an app password, as "ARAL Property Inspection Service". Settings has a "send me a test email" button.</w:t>
+        <w:t xml:space="preserve">Specialist subcontractors (concrete testing, pool, waterproofing, drone) recorded as job costs.</w:t>
+      </w:r>
+    </w:p>
+    <w:p>
+      <w:pPr>
+        <w:pStyle w:val="Heading1"/>
+        <w:spacing w:after="200" w:before="480"/>
+      </w:pPr>
+      <w:r>
+        <w:t xml:space="preserve">16. Email</w:t>
       </w:r>
     </w:p>
     <w:p>
@@ -25335,79 +27399,7 @@
         <w:spacing w:after="60" w:line="290"/>
       </w:pPr>
       <w:r>
-        <w:t xml:space="preserve">English templates the Super Admin can edit, with fields such as </w:t>
-      </w:r>
-      <w:r>
-        <w:rPr>
-          <w:rFonts w:ascii="Consolas" w:cs="Consolas" w:eastAsia="Consolas" w:hAnsi="Consolas"/>
-          <w:color w:val="0B4F8C"/>
-          <w:sz w:val="19"/>
-          <w:szCs w:val="19"/>
-        </w:rPr>
-        <w:t xml:space="preserve">{{client_name}}</w:t>
-      </w:r>
-      <w:r>
-        <w:t xml:space="preserve">, </w:t>
-      </w:r>
-      <w:r>
-        <w:rPr>
-          <w:rFonts w:ascii="Consolas" w:cs="Consolas" w:eastAsia="Consolas" w:hAnsi="Consolas"/>
-          <w:color w:val="0B4F8C"/>
-          <w:sz w:val="19"/>
-          <w:szCs w:val="19"/>
-        </w:rPr>
-        <w:t xml:space="preserve">{{job_no}}</w:t>
-      </w:r>
-      <w:r>
-        <w:t xml:space="preserve">, </w:t>
-      </w:r>
-      <w:r>
-        <w:rPr>
-          <w:rFonts w:ascii="Consolas" w:cs="Consolas" w:eastAsia="Consolas" w:hAnsi="Consolas"/>
-          <w:color w:val="0B4F8C"/>
-          <w:sz w:val="19"/>
-          <w:szCs w:val="19"/>
-        </w:rPr>
-        <w:t xml:space="preserve">{{quote_link}}</w:t>
-      </w:r>
-      <w:r>
-        <w:t xml:space="preserve">, </w:t>
-      </w:r>
-      <w:r>
-        <w:rPr>
-          <w:rFonts w:ascii="Consolas" w:cs="Consolas" w:eastAsia="Consolas" w:hAnsi="Consolas"/>
-          <w:color w:val="0B4F8C"/>
-          <w:sz w:val="19"/>
-          <w:szCs w:val="19"/>
-        </w:rPr>
-        <w:t xml:space="preserve">{{pay_link}}</w:t>
-      </w:r>
-      <w:r>
-        <w:t xml:space="preserve">, </w:t>
-      </w:r>
-      <w:r>
-        <w:rPr>
-          <w:rFonts w:ascii="Consolas" w:cs="Consolas" w:eastAsia="Consolas" w:hAnsi="Consolas"/>
-          <w:color w:val="0B4F8C"/>
-          <w:sz w:val="19"/>
-          <w:szCs w:val="19"/>
-        </w:rPr>
-        <w:t xml:space="preserve">{{inspection_date}}</w:t>
-      </w:r>
-      <w:r>
-        <w:t xml:space="preserve">, </w:t>
-      </w:r>
-      <w:r>
-        <w:rPr>
-          <w:rFonts w:ascii="Consolas" w:cs="Consolas" w:eastAsia="Consolas" w:hAnsi="Consolas"/>
-          <w:color w:val="0B4F8C"/>
-          <w:sz w:val="19"/>
-          <w:szCs w:val="19"/>
-        </w:rPr>
-        <w:t xml:space="preserve">{{report_link}}</w:t>
-      </w:r>
-      <w:r>
-        <w:t xml:space="preserve">.</w:t>
+        <w:t xml:space="preserve">Sent from Gmail with an app password, as "ARAL Property Inspection Service". Settings has a "send me a test email" button.</w:t>
       </w:r>
     </w:p>
     <w:p>
@@ -25420,7 +27412,79 @@
         <w:spacing w:after="60" w:line="290"/>
       </w:pPr>
       <w:r>
-        <w:t xml:space="preserve">Templates: lead follow-up, request received, quotation, quotation reminder, agreement, payment receipt, inspection confirmation and reminder, no access, report issued, invoice, payment reminder, re-inspection due, feedback request.</w:t>
+        <w:t xml:space="preserve">English templates the Super Admin can edit, with fields such as </w:t>
+      </w:r>
+      <w:r>
+        <w:rPr>
+          <w:rFonts w:ascii="Consolas" w:cs="Consolas" w:eastAsia="Consolas" w:hAnsi="Consolas"/>
+          <w:color w:val="0B4F8C"/>
+          <w:sz w:val="19"/>
+          <w:szCs w:val="19"/>
+        </w:rPr>
+        <w:t xml:space="preserve">{{client_name}}</w:t>
+      </w:r>
+      <w:r>
+        <w:t xml:space="preserve">, </w:t>
+      </w:r>
+      <w:r>
+        <w:rPr>
+          <w:rFonts w:ascii="Consolas" w:cs="Consolas" w:eastAsia="Consolas" w:hAnsi="Consolas"/>
+          <w:color w:val="0B4F8C"/>
+          <w:sz w:val="19"/>
+          <w:szCs w:val="19"/>
+        </w:rPr>
+        <w:t xml:space="preserve">{{job_no}}</w:t>
+      </w:r>
+      <w:r>
+        <w:t xml:space="preserve">, </w:t>
+      </w:r>
+      <w:r>
+        <w:rPr>
+          <w:rFonts w:ascii="Consolas" w:cs="Consolas" w:eastAsia="Consolas" w:hAnsi="Consolas"/>
+          <w:color w:val="0B4F8C"/>
+          <w:sz w:val="19"/>
+          <w:szCs w:val="19"/>
+        </w:rPr>
+        <w:t xml:space="preserve">{{quote_link}}</w:t>
+      </w:r>
+      <w:r>
+        <w:t xml:space="preserve">, </w:t>
+      </w:r>
+      <w:r>
+        <w:rPr>
+          <w:rFonts w:ascii="Consolas" w:cs="Consolas" w:eastAsia="Consolas" w:hAnsi="Consolas"/>
+          <w:color w:val="0B4F8C"/>
+          <w:sz w:val="19"/>
+          <w:szCs w:val="19"/>
+        </w:rPr>
+        <w:t xml:space="preserve">{{pay_link}}</w:t>
+      </w:r>
+      <w:r>
+        <w:t xml:space="preserve">, </w:t>
+      </w:r>
+      <w:r>
+        <w:rPr>
+          <w:rFonts w:ascii="Consolas" w:cs="Consolas" w:eastAsia="Consolas" w:hAnsi="Consolas"/>
+          <w:color w:val="0B4F8C"/>
+          <w:sz w:val="19"/>
+          <w:szCs w:val="19"/>
+        </w:rPr>
+        <w:t xml:space="preserve">{{inspection_date}}</w:t>
+      </w:r>
+      <w:r>
+        <w:t xml:space="preserve">, </w:t>
+      </w:r>
+      <w:r>
+        <w:rPr>
+          <w:rFonts w:ascii="Consolas" w:cs="Consolas" w:eastAsia="Consolas" w:hAnsi="Consolas"/>
+          <w:color w:val="0B4F8C"/>
+          <w:sz w:val="19"/>
+          <w:szCs w:val="19"/>
+        </w:rPr>
+        <w:t xml:space="preserve">{{report_link}}</w:t>
+      </w:r>
+      <w:r>
+        <w:t xml:space="preserve">.</w:t>
       </w:r>
     </w:p>
     <w:p>
@@ -25433,16 +27497,7 @@
         <w:spacing w:after="60" w:line="290"/>
       </w:pPr>
       <w:r>
-        <w:t xml:space="preserve">The relevant PDF is attached; every email is logged and retried on failure. A warning shows near Gmail’s limit of about 500 emails a day.</w:t>
-      </w:r>
-    </w:p>
-    <w:p>
-      <w:pPr>
-        <w:pStyle w:val="Heading1"/>
-        <w:spacing w:after="200" w:before="480"/>
-      </w:pPr>
-      <w:r>
-        <w:t xml:space="preserve">17. Admin controls</w:t>
+        <w:t xml:space="preserve">Templates: lead follow-up, request received, quotation, quotation reminder, agreement, payment receipt, inspection confirmation and reminder, no access, report issued, invoice, payment reminder, re-inspection due, feedback request.</w:t>
       </w:r>
     </w:p>
     <w:p>
@@ -25455,14 +27510,16 @@
         <w:spacing w:after="60" w:line="290"/>
       </w:pPr>
       <w:r>
-        <w:rPr>
-          <w:b/>
-          <w:bCs/>
-        </w:rPr>
-        <w:t xml:space="preserve">Users:</w:t>
-      </w:r>
-      <w:r>
-        <w:t xml:space="preserve"> add, deactivate, set roles, reset passwords and two-step codes.</w:t>
+        <w:t xml:space="preserve">The relevant PDF is attached; every email is logged and retried on failure. A warning shows near Gmail’s limit of about 500 emails a day.</w:t>
+      </w:r>
+    </w:p>
+    <w:p>
+      <w:pPr>
+        <w:pStyle w:val="Heading1"/>
+        <w:spacing w:after="200" w:before="480"/>
+      </w:pPr>
+      <w:r>
+        <w:t xml:space="preserve">17. Admin controls</w:t>
       </w:r>
     </w:p>
     <w:p>
@@ -25479,10 +27536,10 @@
           <w:b/>
           <w:bCs/>
         </w:rPr>
-        <w:t xml:space="preserve">Company:</w:t>
-      </w:r>
-      <w:r>
-        <w:t xml:space="preserve"> name, branch addresses, DET licence no., RERA no., TRN, logo, bank details, signatures, insurance details.</w:t>
+        <w:t xml:space="preserve">Users:</w:t>
+      </w:r>
+      <w:r>
+        <w:t xml:space="preserve"> add, deactivate, set roles, reset passwords and two-step codes.</w:t>
       </w:r>
     </w:p>
     <w:p>
@@ -25499,10 +27556,10 @@
           <w:b/>
           <w:bCs/>
         </w:rPr>
-        <w:t xml:space="preserve">Terms and wording:</w:t>
-      </w:r>
-      <w:r>
-        <w:t xml:space="preserve"> one version-controlled text per document and report page, with a start date. Each issued document records the version it used.</w:t>
+        <w:t xml:space="preserve">Company:</w:t>
+      </w:r>
+      <w:r>
+        <w:t xml:space="preserve"> name, branch addresses, DET licence no., RERA no., TRN, logo, bank details, signatures, insurance details.</w:t>
       </w:r>
     </w:p>
     <w:p>
@@ -25519,10 +27576,10 @@
           <w:b/>
           <w:bCs/>
         </w:rPr>
-        <w:t xml:space="preserve">Catalogue:</w:t>
-      </w:r>
-      <w:r>
-        <w:t xml:space="preserve"> services, prices, the thermal add-on, discount limits, bank rate cards.</w:t>
+        <w:t xml:space="preserve">Terms and wording:</w:t>
+      </w:r>
+      <w:r>
+        <w:t xml:space="preserve"> one version-controlled text per document and report page, with a start date. Each issued document records the version it used.</w:t>
       </w:r>
     </w:p>
     <w:p>
@@ -25539,10 +27596,10 @@
           <w:b/>
           <w:bCs/>
         </w:rPr>
-        <w:t xml:space="preserve">Checklists, comment library and glossary</w:t>
-      </w:r>
-      <w:r>
-        <w:t xml:space="preserve"> (Super Admin and Technical Manager).</w:t>
+        <w:t xml:space="preserve">Catalogue:</w:t>
+      </w:r>
+      <w:r>
+        <w:t xml:space="preserve"> services, prices, the thermal add-on, discount limits, bank rate cards.</w:t>
       </w:r>
     </w:p>
     <w:p>
@@ -25559,7 +27616,10 @@
           <w:b/>
           <w:bCs/>
         </w:rPr>
-        <w:t xml:space="preserve">Numbering, VAT switch, quote validity, deposit, reminders and SLA targets.</w:t>
+        <w:t xml:space="preserve">Checklists, comment library and glossary</w:t>
+      </w:r>
+      <w:r>
+        <w:t xml:space="preserve"> (Super Admin and Technical Manager).</w:t>
       </w:r>
     </w:p>
     <w:p>
@@ -25576,10 +27636,7 @@
           <w:b/>
           <w:bCs/>
         </w:rPr>
-        <w:t xml:space="preserve">Picklists:</w:t>
-      </w:r>
-      <w:r>
-        <w:t xml:space="preserve"> property types, communities, developers, purposes, banks, materials, trades, lost reasons.</w:t>
+        <w:t xml:space="preserve">Numbering, VAT switch, quote validity, deposit, reminders and SLA targets.</w:t>
       </w:r>
     </w:p>
     <w:p>
@@ -25596,19 +27653,10 @@
           <w:b/>
           <w:bCs/>
         </w:rPr>
-        <w:t xml:space="preserve">Audit log:</w:t>
-      </w:r>
-      <w:r>
-        <w:t xml:space="preserve"> who, what, when, before and after, from where; searchable and exportable.</w:t>
-      </w:r>
-    </w:p>
-    <w:p>
-      <w:pPr>
-        <w:pStyle w:val="Heading1"/>
-        <w:spacing w:after="200" w:before="480"/>
-      </w:pPr>
-      <w:r>
-        <w:t xml:space="preserve">18. Dashboard, KPIs and Excel</w:t>
+        <w:t xml:space="preserve">Picklists:</w:t>
+      </w:r>
+      <w:r>
+        <w:t xml:space="preserve"> property types, communities, developers, purposes, banks, materials, trades, lost reasons.</w:t>
       </w:r>
     </w:p>
     <w:p>
@@ -25625,10 +27673,19 @@
           <w:b/>
           <w:bCs/>
         </w:rPr>
-        <w:t xml:space="preserve">Dashboard:</w:t>
-      </w:r>
-      <w:r>
-        <w:t xml:space="preserve"> new leads and response time, jobs by status, jobs this month against the target (100 a month by month 12), revenue by client group, money owed, SLA compliance, average turnaround, inspector workload, equipment use, review score (target 4.8), quote conversion, bookings by source.</w:t>
+        <w:t xml:space="preserve">Audit log:</w:t>
+      </w:r>
+      <w:r>
+        <w:t xml:space="preserve"> who, what, when, before and after, from where; searchable and exportable.</w:t>
+      </w:r>
+    </w:p>
+    <w:p>
+      <w:pPr>
+        <w:pStyle w:val="Heading1"/>
+        <w:spacing w:after="200" w:before="480"/>
+      </w:pPr>
+      <w:r>
+        <w:t xml:space="preserve">18. Dashboard, KPIs and Excel</w:t>
       </w:r>
     </w:p>
     <w:p>
@@ -25645,20 +27702,10 @@
           <w:b/>
           <w:bCs/>
         </w:rPr>
-        <w:t xml:space="preserve">Every list</w:t>
-      </w:r>
-      <w:r>
-        <w:t xml:space="preserve"> has filters, search and </w:t>
-      </w:r>
-      <w:r>
-        <w:rPr>
-          <w:b/>
-          <w:bCs/>
-        </w:rPr>
-        <w:t xml:space="preserve">Export to Excel</w:t>
-      </w:r>
-      <w:r>
-        <w:t xml:space="preserve"> of exactly what is shown.</w:t>
+        <w:t xml:space="preserve">Dashboard:</w:t>
+      </w:r>
+      <w:r>
+        <w:t xml:space="preserve"> new leads and response time, jobs by status, jobs this month against the target (100 a month by month 12), revenue by client group, money owed, SLA compliance, average turnaround, inspector workload, equipment use, review score (target 4.8), quote conversion, bookings by source.</w:t>
       </w:r>
     </w:p>
     <w:p>
@@ -25675,19 +27722,20 @@
           <w:b/>
           <w:bCs/>
         </w:rPr>
-        <w:t xml:space="preserve">Ready-made exports:</w:t>
-      </w:r>
-      <w:r>
-        <w:t xml:space="preserve"> lead register, job register, SLA report per bank, quotations, invoices with VAT summary, payments, aging, commissions, equipment calibration.</w:t>
-      </w:r>
-    </w:p>
-    <w:p>
-      <w:pPr>
-        <w:pStyle w:val="Heading1"/>
-        <w:spacing w:after="200" w:before="480"/>
-      </w:pPr>
-      <w:r>
-        <w:t xml:space="preserve">19. Quality, security and hosting</w:t>
+        <w:t xml:space="preserve">Every list</w:t>
+      </w:r>
+      <w:r>
+        <w:t xml:space="preserve"> has filters, search and </w:t>
+      </w:r>
+      <w:r>
+        <w:rPr>
+          <w:b/>
+          <w:bCs/>
+        </w:rPr>
+        <w:t xml:space="preserve">Export to Excel</w:t>
+      </w:r>
+      <w:r>
+        <w:t xml:space="preserve"> of exactly what is shown.</w:t>
       </w:r>
     </w:p>
     <w:p>
@@ -25700,7 +27748,23 @@
         <w:spacing w:after="60" w:line="290"/>
       </w:pPr>
       <w:r>
-        <w:t xml:space="preserve">Screens fully in English and Arabic with right-to-left layout; no fixed text outside the dictionaries.</w:t>
+        <w:rPr>
+          <w:b/>
+          <w:bCs/>
+        </w:rPr>
+        <w:t xml:space="preserve">Ready-made exports:</w:t>
+      </w:r>
+      <w:r>
+        <w:t xml:space="preserve"> lead register, job register, SLA report per bank, quotations, invoices with VAT summary, payments, aging, commissions, equipment calibration.</w:t>
+      </w:r>
+    </w:p>
+    <w:p>
+      <w:pPr>
+        <w:pStyle w:val="Heading1"/>
+        <w:spacing w:after="200" w:before="480"/>
+      </w:pPr>
+      <w:r>
+        <w:t xml:space="preserve">19. Quality, security and hosting</w:t>
       </w:r>
     </w:p>
     <w:p>
@@ -25713,7 +27777,7 @@
         <w:spacing w:after="60" w:line="290"/>
       </w:pPr>
       <w:r>
-        <w:t xml:space="preserve">Security: OWASP Top 10, validation on the server for every request, rate limits, protection against cross-site requests, secrets only in environment settings, HTTPS, signed expiring links for files.</w:t>
+        <w:t xml:space="preserve">Screens fully in English and Arabic with right-to-left layout; no fixed text outside the dictionaries.</w:t>
       </w:r>
     </w:p>
     <w:p>
@@ -25726,14 +27790,7 @@
         <w:spacing w:after="60" w:line="290"/>
       </w:pPr>
       <w:r>
-        <w:rPr>
-          <w:b/>
-          <w:bCs/>
-        </w:rPr>
-        <w:t xml:space="preserve">UAE data protection (PDPL):</w:t>
-      </w:r>
-      <w:r>
-        <w:t xml:space="preserve"> retention rules per record type, consent, export or deletion of a client’s data on request, access logs. Write it up so bank security questionnaires can be answered from it.</w:t>
+        <w:t xml:space="preserve">Security: OWASP Top 10, validation on the server for every request, rate limits, protection against cross-site requests, secrets only in environment settings, HTTPS, signed expiring links for files.</w:t>
       </w:r>
     </w:p>
     <w:p>
@@ -25746,7 +27803,47 @@
         <w:spacing w:after="60" w:line="290"/>
       </w:pPr>
       <w:r>
+        <w:rPr>
+          <w:b/>
+          <w:bCs/>
+        </w:rPr>
+        <w:t xml:space="preserve">UAE data protection (PDPL):</w:t>
+      </w:r>
+      <w:r>
+        <w:t xml:space="preserve"> retention rules per record type, consent, export or deletion of a client’s data on request, access logs. Write it up so bank security questionnaires can be answered from it.</w:t>
+      </w:r>
+    </w:p>
+    <w:p>
+      <w:pPr>
+        <w:pStyle w:val="ListParagraph"/>
+        <w:numPr>
+          <w:ilvl w:val="0"/>
+          <w:numId w:val="2"/>
+        </w:numPr>
+        <w:spacing w:after="60" w:line="290"/>
+      </w:pPr>
+      <w:r>
         <w:t xml:space="preserve">Daily backups with a tested restore. Master data is deactivated rather than deleted.</w:t>
+      </w:r>
+    </w:p>
+    <w:p>
+      <w:pPr>
+        <w:pStyle w:val="ListParagraph"/>
+        <w:numPr>
+          <w:ilvl w:val="0"/>
+          <w:numId w:val="2"/>
+        </w:numPr>
+        <w:spacing w:after="60" w:line="290"/>
+      </w:pPr>
+      <w:r>
+        <w:rPr>
+          <w:b/>
+          <w:bCs/>
+        </w:rPr>
+        <w:t xml:space="preserve">Upgrades keep data:</w:t>
+      </w:r>
+      <w:r>
+        <w:t xml:space="preserve"> on start-up the app adds any new database columns and upgrades the checklists once, so a redeploy never needs manual database changes.</w:t>
       </w:r>
     </w:p>
     <w:p>
@@ -26192,7 +28289,7 @@
                 <w:sz w:val="18"/>
                 <w:szCs w:val="18"/>
               </w:rPr>
-              <w:t xml:space="preserve">Leads, requests, pricing engine, quotations, PDF engine</w:t>
+              <w:t xml:space="preserve">Leads, website, requests, pricing engine, quotations, PDF engine</w:t>
             </w:r>
           </w:p>
         </w:tc>
@@ -26223,7 +28320,7 @@
                 <w:sz w:val="18"/>
                 <w:szCs w:val="18"/>
               </w:rPr>
-              <w:t xml:space="preserve">Next</w:t>
+              <w:t xml:space="preserve">Delivered</w:t>
             </w:r>
           </w:p>
         </w:tc>
@@ -26292,7 +28389,7 @@
                 <w:sz w:val="18"/>
                 <w:szCs w:val="18"/>
               </w:rPr>
-              <w:t xml:space="preserve">Agreement, demo card payments, email templates</w:t>
+              <w:t xml:space="preserve">Agreement e-signature, demo card payments, office card payments, email templates</w:t>
             </w:r>
           </w:p>
         </w:tc>
@@ -26319,6 +28416,13 @@
               <w:keepNext w:val="false"/>
               <w:spacing w:after="20" w:line="260"/>
             </w:pPr>
+            <w:r>
+              <w:rPr>
+                <w:sz w:val="18"/>
+                <w:szCs w:val="18"/>
+              </w:rPr>
+              <w:t xml:space="preserve">Delivered</w:t>
+            </w:r>
           </w:p>
         </w:tc>
       </w:tr>
@@ -26384,7 +28488,7 @@
                 <w:sz w:val="18"/>
                 <w:szCs w:val="18"/>
               </w:rPr>
-              <w:t xml:space="preserve">Scheduling, equipment, phone inspection app, reports, review, QR verification</w:t>
+              <w:t xml:space="preserve">Scheduling, equipment, calendar, phone inspection app, attachments, reports, review, QR verification</w:t>
             </w:r>
           </w:p>
         </w:tc>
@@ -26410,6 +28514,13 @@
               <w:keepNext w:val="false"/>
               <w:spacing w:after="20" w:line="260"/>
             </w:pPr>
+            <w:r>
+              <w:rPr>
+                <w:sz w:val="18"/>
+                <w:szCs w:val="18"/>
+              </w:rPr>
+              <w:t xml:space="preserve">Delivered, in testing</w:t>
+            </w:r>
           </w:p>
         </w:tc>
       </w:tr>
@@ -26477,7 +28588,7 @@
                 <w:sz w:val="18"/>
                 <w:szCs w:val="18"/>
               </w:rPr>
-              <w:t xml:space="preserve">Invoices, VAT switch, credit notes, commissions, client and partner portals</w:t>
+              <w:t xml:space="preserve">Invoices, VAT switch, credit notes, commissions</w:t>
             </w:r>
           </w:p>
         </w:tc>
@@ -26504,6 +28615,13 @@
               <w:keepNext w:val="false"/>
               <w:spacing w:after="20" w:line="260"/>
             </w:pPr>
+            <w:r>
+              <w:rPr>
+                <w:sz w:val="18"/>
+                <w:szCs w:val="18"/>
+              </w:rPr>
+              <w:t xml:space="preserve">Delivered, in testing</w:t>
+            </w:r>
           </w:p>
         </w:tc>
       </w:tr>
@@ -26595,6 +28713,13 @@
               <w:keepNext w:val="false"/>
               <w:spacing w:after="20" w:line="260"/>
             </w:pPr>
+            <w:r>
+              <w:rPr>
+                <w:sz w:val="18"/>
+                <w:szCs w:val="18"/>
+              </w:rPr>
+              <w:t xml:space="preserve">Delivered</w:t>
+            </w:r>
           </w:p>
         </w:tc>
       </w:tr>
@@ -26662,7 +28787,7 @@
                 <w:sz w:val="18"/>
                 <w:szCs w:val="18"/>
               </w:rPr>
-              <w:t xml:space="preserve">Tests, security review, deployment, user guide</w:t>
+              <w:t xml:space="preserve">Client and partner portals, bulk upload for banks, user guide, go-live settings</w:t>
             </w:r>
           </w:p>
         </w:tc>
@@ -26689,6 +28814,13 @@
               <w:keepNext w:val="false"/>
               <w:spacing w:after="20" w:line="260"/>
             </w:pPr>
+            <w:r>
+              <w:rPr>
+                <w:sz w:val="18"/>
+                <w:szCs w:val="18"/>
+              </w:rPr>
+              <w:t xml:space="preserve">Next</w:t>
+            </w:r>
           </w:p>
         </w:tc>
       </w:tr>

</xml_diff>